<commit_message>
docs: finalize checkpoint report and submission files
</commit_message>
<xml_diff>
--- a/docs/Islam Alhallak Cloud Based Web System Design Checkpoint.docx
+++ b/docs/Islam Alhallak Cloud Based Web System Design Checkpoint.docx
@@ -4,20 +4,219 @@
   <w:body>
     <w:p>
       <w:pPr>
+        <w:spacing w:after="480"/>
+        <w:jc w:val="center"/>
+      </w:pPr>
+      <w:r>
+        <w:rPr>
+          <w:noProof/>
+        </w:rPr>
+        <w:drawing>
+          <wp:inline distT="0" distB="0" distL="0" distR="0" wp14:anchorId="1173431C" wp14:editId="3EC3DE8A">
+            <wp:extent cx="1016000" cy="1016000"/>
+            <wp:effectExtent l="0" t="0" r="0" b="0"/>
+            <wp:docPr id="1469867443" name="Picture 3" descr="gomycode | El Biar"/>
+            <wp:cNvGraphicFramePr>
+              <a:graphicFrameLocks xmlns:a="http://schemas.openxmlformats.org/drawingml/2006/main" noChangeAspect="1"/>
+            </wp:cNvGraphicFramePr>
+            <a:graphic xmlns:a="http://schemas.openxmlformats.org/drawingml/2006/main">
+              <a:graphicData uri="http://schemas.openxmlformats.org/drawingml/2006/picture">
+                <pic:pic xmlns:pic="http://schemas.openxmlformats.org/drawingml/2006/picture">
+                  <pic:nvPicPr>
+                    <pic:cNvPr id="1469867443" name="Picture 3" descr="gomycode | El Biar"/>
+                    <pic:cNvPicPr/>
+                  </pic:nvPicPr>
+                  <pic:blipFill>
+                    <a:blip r:embed="rId7" cstate="print">
+                      <a:extLst>
+                        <a:ext uri="{28A0092B-C50C-407E-A947-70E740481C1C}">
+                          <a14:useLocalDpi xmlns:a14="http://schemas.microsoft.com/office/drawing/2010/main" val="0"/>
+                        </a:ext>
+                      </a:extLst>
+                    </a:blip>
+                    <a:stretch>
+                      <a:fillRect/>
+                    </a:stretch>
+                  </pic:blipFill>
+                  <pic:spPr>
+                    <a:xfrm>
+                      <a:off x="0" y="0"/>
+                      <a:ext cx="1016000" cy="1016000"/>
+                    </a:xfrm>
+                    <a:prstGeom prst="rect">
+                      <a:avLst/>
+                    </a:prstGeom>
+                  </pic:spPr>
+                </pic:pic>
+              </a:graphicData>
+            </a:graphic>
+          </wp:inline>
+        </w:drawing>
+      </w:r>
+      <w:r>
+        <w:rPr>
+          <w:noProof/>
+        </w:rPr>
+        <w:t xml:space="preserve">      </w:t>
+      </w:r>
+      <w:r>
+        <w:rPr>
+          <w:noProof/>
+        </w:rPr>
+        <w:drawing>
+          <wp:inline distT="0" distB="0" distL="0" distR="0" wp14:anchorId="30A7922D" wp14:editId="30381859">
+            <wp:extent cx="3632452" cy="1016000"/>
+            <wp:effectExtent l="0" t="0" r="6350" b="0"/>
+            <wp:docPr id="53802443" name="Picture 4" descr="GMC School of Technology"/>
+            <wp:cNvGraphicFramePr>
+              <a:graphicFrameLocks xmlns:a="http://schemas.openxmlformats.org/drawingml/2006/main" noChangeAspect="1"/>
+            </wp:cNvGraphicFramePr>
+            <a:graphic xmlns:a="http://schemas.openxmlformats.org/drawingml/2006/main">
+              <a:graphicData uri="http://schemas.openxmlformats.org/drawingml/2006/picture">
+                <pic:pic xmlns:pic="http://schemas.openxmlformats.org/drawingml/2006/picture">
+                  <pic:nvPicPr>
+                    <pic:cNvPr id="53802443" name="Picture 4" descr="GMC School of Technology"/>
+                    <pic:cNvPicPr/>
+                  </pic:nvPicPr>
+                  <pic:blipFill>
+                    <a:blip r:embed="rId8" cstate="print">
+                      <a:extLst>
+                        <a:ext uri="{28A0092B-C50C-407E-A947-70E740481C1C}">
+                          <a14:useLocalDpi xmlns:a14="http://schemas.microsoft.com/office/drawing/2010/main" val="0"/>
+                        </a:ext>
+                      </a:extLst>
+                    </a:blip>
+                    <a:stretch>
+                      <a:fillRect/>
+                    </a:stretch>
+                  </pic:blipFill>
+                  <pic:spPr>
+                    <a:xfrm>
+                      <a:off x="0" y="0"/>
+                      <a:ext cx="3632452" cy="1016000"/>
+                    </a:xfrm>
+                    <a:prstGeom prst="rect">
+                      <a:avLst/>
+                    </a:prstGeom>
+                  </pic:spPr>
+                </pic:pic>
+              </a:graphicData>
+            </a:graphic>
+          </wp:inline>
+        </w:drawing>
+      </w:r>
+    </w:p>
+    <w:p>
+      <w:pPr>
+        <w:pStyle w:val="Subtitle"/>
+        <w:spacing w:after="120"/>
+        <w:jc w:val="center"/>
+        <w:rPr>
+          <w:b/>
+          <w:sz w:val="28"/>
+        </w:rPr>
+      </w:pPr>
+      <w:r>
+        <w:rPr>
+          <w:b/>
+          <w:sz w:val="28"/>
+        </w:rPr>
+        <w:t>GOMYCODE</w:t>
+      </w:r>
+    </w:p>
+    <w:p>
+      <w:pPr>
+        <w:pStyle w:val="Subtitle"/>
+        <w:spacing w:after="120"/>
+        <w:jc w:val="center"/>
+        <w:rPr>
+          <w:b/>
+          <w:sz w:val="28"/>
+        </w:rPr>
+      </w:pPr>
+      <w:r>
+        <w:rPr>
+          <w:b/>
+          <w:sz w:val="28"/>
+        </w:rPr>
+        <w:t>GMC School of Technology (Woolf)</w:t>
+      </w:r>
+    </w:p>
+    <w:p>
+      <w:pPr>
         <w:pStyle w:val="Title"/>
-        <w:spacing w:line="276" w:lineRule="auto"/>
-      </w:pPr>
-      <w:r>
-        <w:t>Daaist Cloud Platform for Architecture Students and Student Clubs</w:t>
+        <w:spacing w:before="1920" w:after="480" w:line="276" w:lineRule="auto"/>
+        <w:jc w:val="center"/>
+      </w:pPr>
+      <w:r>
+        <w:t>Daa</w:t>
+      </w:r>
+      <w:r>
+        <w:t>’</w:t>
+      </w:r>
+      <w:r>
+        <w:t>ist Cloud Platform for Architecture Students and Student Clubs</w:t>
       </w:r>
     </w:p>
     <w:p>
       <w:pPr>
         <w:pStyle w:val="Subtitle"/>
-        <w:spacing w:line="276" w:lineRule="auto"/>
-      </w:pPr>
-      <w:r>
-        <w:t>Islam Alhallak | Cloud-Based Web System Design | 27 October 2026</w:t>
+        <w:spacing w:after="240" w:line="276" w:lineRule="auto"/>
+        <w:jc w:val="center"/>
+        <w:rPr>
+          <w:sz w:val="28"/>
+        </w:rPr>
+      </w:pPr>
+      <w:r>
+        <w:rPr>
+          <w:sz w:val="28"/>
+        </w:rPr>
+        <w:t>Cloud-Based Web System Design</w:t>
+      </w:r>
+    </w:p>
+    <w:p>
+      <w:pPr>
+        <w:pStyle w:val="Subtitle"/>
+        <w:spacing w:after="240"/>
+        <w:jc w:val="center"/>
+        <w:rPr>
+          <w:sz w:val="28"/>
+        </w:rPr>
+      </w:pPr>
+      <w:r>
+        <w:rPr>
+          <w:sz w:val="28"/>
+        </w:rPr>
+        <w:t>Islam Alhallak</w:t>
+      </w:r>
+    </w:p>
+    <w:p>
+      <w:pPr>
+        <w:pStyle w:val="Subtitle"/>
+        <w:jc w:val="center"/>
+        <w:rPr>
+          <w:sz w:val="28"/>
+        </w:rPr>
+      </w:pPr>
+      <w:r>
+        <w:rPr>
+          <w:sz w:val="28"/>
+        </w:rPr>
+        <w:t>2026</w:t>
+      </w:r>
+    </w:p>
+    <w:p>
+      <w:pPr>
+        <w:spacing w:after="0"/>
+        <w:rPr>
+          <w:sz w:val="2"/>
+        </w:rPr>
+      </w:pPr>
+      <w:r>
+        <w:rPr>
+          <w:sz w:val="2"/>
+        </w:rPr>
+        <w:br w:type="page"/>
       </w:r>
     </w:p>
     <w:p>
@@ -26,6 +225,7 @@
         <w:spacing w:line="276" w:lineRule="auto"/>
       </w:pPr>
       <w:r>
+        <w:lastRenderedPageBreak/>
         <w:t>Abstract</w:t>
       </w:r>
     </w:p>
@@ -34,7 +234,19 @@
         <w:spacing w:line="276" w:lineRule="auto"/>
       </w:pPr>
       <w:r>
-        <w:t>Daa’ist is a web platform at https://daaist.com for architecture students at the Département d’Architecture d’Alger (DAA). It combines a catalogue of course notes, tutorials, past exams and administrative documents with club pages, public event registration and QR attendance passes. Next.js provides the interface and server routes; Supabase supplies authentication, PostgreSQL, Realtime and image storage; Cloudflare R2 stores learning resources. An external API generates wind rose and sun path diagrams.</w:t>
+        <w:t>Daa’ist is a web platform at https://daaist.com for architecture students at the D</w:t>
+      </w:r>
+      <w:r>
+        <w:t xml:space="preserve">epartment of </w:t>
+      </w:r>
+      <w:r>
+        <w:t xml:space="preserve">Architecture </w:t>
+      </w:r>
+      <w:r>
+        <w:t>of Algiers</w:t>
+      </w:r>
+      <w:r>
+        <w:t xml:space="preserve"> (DAA). It combines a catalogue of course notes, tutorials, past exams and administrative documents with club pages, public event registration and QR attendance passes. Next.js provides the interface and server routes; Supabase supplies authentication, PostgreSQL, Realtime and image storage; Cloudflare R2 stores learning resources. An external API generates wind rose and sun path diagrams.</w:t>
       </w:r>
     </w:p>
     <w:p>
@@ -42,7 +254,42 @@
         <w:spacing w:line="276" w:lineRule="auto"/>
       </w:pPr>
       <w:r>
-        <w:t>Evaluation on 27 October 2026 records 132 passing tests across nine files, successful TypeScript and production-build checks, and four passing anonymous browser checks. ESLint reports 85 errors and 10 warnings. GitHub returns no Actions runs; the local workflow is ignored and untracked. These results support selected functionality while user impact, load capacity and comprehensive production assurance remain unproven.</w:t>
+        <w:t>In October 2026, all 132 tests across nine files passed. TypeScript and the production build also succeeded, as did four</w:t>
+      </w:r>
+      <w:r>
+        <w:t xml:space="preserve"> anonymous browser checks. </w:t>
+      </w:r>
+      <w:proofErr w:type="spellStart"/>
+      <w:r>
+        <w:t>ESLint</w:t>
+      </w:r>
+      <w:proofErr w:type="spellEnd"/>
+      <w:r>
+        <w:t xml:space="preserve"> </w:t>
+      </w:r>
+      <w:r>
+        <w:t>reported 85 errors and 10 warnings. GitHub showed</w:t>
+      </w:r>
+      <w:r>
+        <w:t xml:space="preserve"> no Actions runs; the local workflow is ignored and untracked. </w:t>
+      </w:r>
+      <w:r>
+        <w:t>U</w:t>
+      </w:r>
+      <w:r>
+        <w:t>ser impact</w:t>
+      </w:r>
+      <w:r>
+        <w:t xml:space="preserve"> and</w:t>
+      </w:r>
+      <w:r>
+        <w:t xml:space="preserve"> load capacity </w:t>
+      </w:r>
+      <w:r>
+        <w:t>have not yet been measured</w:t>
+      </w:r>
+      <w:r>
+        <w:t>.</w:t>
       </w:r>
     </w:p>
     <w:p>
@@ -62,7 +309,19 @@
         <w:spacing w:line="276" w:lineRule="auto"/>
       </w:pPr>
       <w:r>
-        <w:t>I experienced difficulty finding and obtaining official student documents that should have been accessible for my studies. Course resources shared through separate channels created a similar problem. Daa’ist addresses these needs through a departmental collection organised by study year and subject. This motivation reflects personal experience, rather than a quantified departmental survey.</w:t>
+        <w:t xml:space="preserve">I experienced difficulty finding and obtaining official student documents that should have been accessible for my studies. Course resources shared through separate channels created a similar problem. Daa’ist addresses these needs through a departmental collection organised by study year and subject. This motivation </w:t>
+      </w:r>
+      <w:r>
+        <w:t>comes from my own</w:t>
+      </w:r>
+      <w:r>
+        <w:t xml:space="preserve"> experience</w:t>
+      </w:r>
+      <w:r>
+        <w:t>; I have not surveyed the department</w:t>
+      </w:r>
+      <w:r>
+        <w:t>.</w:t>
       </w:r>
     </w:p>
     <w:p>
@@ -70,7 +329,13 @@
         <w:pStyle w:val="BodyLead-in"/>
       </w:pPr>
       <w:r>
-        <w:t>The design targets four practical needs:</w:t>
+        <w:t xml:space="preserve">The design </w:t>
+      </w:r>
+      <w:r>
+        <w:t>addresse</w:t>
+      </w:r>
+      <w:r>
+        <w:t>s four needs:</w:t>
       </w:r>
     </w:p>
     <w:p>
@@ -86,10 +351,24 @@
         <w:rPr>
           <w:b/>
         </w:rPr>
-        <w:t>Discoverability.</w:t>
-      </w:r>
-      <w:r>
-        <w:t xml:space="preserve"> Organise resources so students can locate a relevant year and subject without searching a conversation history.</w:t>
+        <w:t>Discoverability</w:t>
+      </w:r>
+      <w:r>
+        <w:rPr>
+          <w:b/>
+        </w:rPr>
+        <w:t>:</w:t>
+      </w:r>
+      <w:r>
+        <w:t xml:space="preserve"> </w:t>
+      </w:r>
+      <w:proofErr w:type="spellStart"/>
+      <w:r>
+        <w:t>organise</w:t>
+      </w:r>
+      <w:proofErr w:type="spellEnd"/>
+      <w:r>
+        <w:t xml:space="preserve"> resources so students can locate a relevant year and subject without searching a conversation history.</w:t>
       </w:r>
     </w:p>
     <w:p>
@@ -105,10 +384,19 @@
         <w:rPr>
           <w:b/>
         </w:rPr>
-        <w:t>Continuity.</w:t>
-      </w:r>
-      <w:r>
-        <w:t xml:space="preserve"> Retain a departmental collection as individual students graduate.</w:t>
+        <w:t>Continuity</w:t>
+      </w:r>
+      <w:r>
+        <w:rPr>
+          <w:b/>
+        </w:rPr>
+        <w:t>:</w:t>
+      </w:r>
+      <w:r>
+        <w:t xml:space="preserve"> retain</w:t>
+      </w:r>
+      <w:r>
+        <w:t xml:space="preserve"> a departmental collection as individual students graduate.</w:t>
       </w:r>
     </w:p>
     <w:p>
@@ -124,10 +412,19 @@
         <w:rPr>
           <w:b/>
         </w:rPr>
-        <w:t>Access control.</w:t>
-      </w:r>
-      <w:r>
-        <w:t xml:space="preserve"> Separate account, publishing and event-management capabilities, and restrict access to participant information.</w:t>
+        <w:t>Access control</w:t>
+      </w:r>
+      <w:r>
+        <w:rPr>
+          <w:b/>
+        </w:rPr>
+        <w:t>:</w:t>
+      </w:r>
+      <w:r>
+        <w:t xml:space="preserve"> separate</w:t>
+      </w:r>
+      <w:r>
+        <w:t xml:space="preserve"> account, publishing and event-management capabilities, and restrict access to participant information.</w:t>
       </w:r>
     </w:p>
     <w:p>
@@ -143,10 +440,19 @@
         <w:rPr>
           <w:b/>
         </w:rPr>
-        <w:t>Club operations.</w:t>
-      </w:r>
-      <w:r>
-        <w:t xml:space="preserve"> Connect event information, registration and attendance within one workflow.</w:t>
+        <w:t>Club operations</w:t>
+      </w:r>
+      <w:r>
+        <w:rPr>
+          <w:b/>
+        </w:rPr>
+        <w:t>:</w:t>
+      </w:r>
+      <w:r>
+        <w:t xml:space="preserve"> connect</w:t>
+      </w:r>
+      <w:r>
+        <w:t xml:space="preserve"> event information, registration and attendance within one workflow.</w:t>
       </w:r>
     </w:p>
     <w:p>
@@ -154,7 +460,22 @@
         <w:spacing w:line="276" w:lineRule="auto"/>
       </w:pPr>
       <w:r>
-        <w:t>The application is maintained by the Archibénévoles student club. Its contribution is the integration of a departmental resource catalogue with student-community operations. The intended benefits are easier retrieval and less fragmented administration; their size has not yet been established through comparative task measurements or a user study.</w:t>
+        <w:t xml:space="preserve">The application is maintained by the Archibénévoles student club. </w:t>
+      </w:r>
+      <w:r>
+        <w:t>It brings the department</w:t>
+      </w:r>
+      <w:r>
+        <w:t>’</w:t>
+      </w:r>
+      <w:r>
+        <w:t>s resource catalogue and the club</w:t>
+      </w:r>
+      <w:r>
+        <w:t>’</w:t>
+      </w:r>
+      <w:r>
+        <w:t>s day-to-day work into one place. The aim is to make resources easier to find and club administration less scattered; neither effect has been measured yet.</w:t>
       </w:r>
     </w:p>
     <w:p>
@@ -163,11 +484,51 @@
         <w:spacing w:line="276" w:lineRule="auto"/>
       </w:pPr>
       <w:r>
+        <w:t>2. Literature</w:t>
+      </w:r>
+      <w:r>
+        <w:t xml:space="preserve"> review</w:t>
+      </w:r>
+    </w:p>
+    <w:p>
+      <w:pPr>
+        <w:spacing w:line="276" w:lineRule="auto"/>
+      </w:pPr>
+      <w:r>
+        <w:t>Prior studies describe how students share course material through messaging groups and the barriers they meet on institutional platforms. They do not test whether a dedicated platform improves learning, so this project treats easier retrieval and continued club</w:t>
+      </w:r>
+      <w:r>
+        <w:t xml:space="preserve"> participation as hypotheses to evaluate.</w:t>
+      </w:r>
+    </w:p>
+    <w:p>
+      <w:pPr>
+        <w:spacing w:line="276" w:lineRule="auto"/>
+      </w:pPr>
+      <w:r>
+        <w:t xml:space="preserve">Baishya and Maheshwari (2020) analysed one year of conversation in four educational WhatsApp groups and interviewed eight participants. Their findings describe academic uses alongside distraction and time burdens. Le Roux and Parry (2022, published online in 2021) surveyed 1,752 undergraduates about academic messaging groups. They found associations with academic and social outcomes, but </w:t>
+      </w:r>
+      <w:r>
         <w:lastRenderedPageBreak/>
-        <w:t>2. Literature</w:t>
-      </w:r>
-      <w:r>
-        <w:t xml:space="preserve"> review</w:t>
+        <w:t xml:space="preserve">questioned the practical significance of the small effects. Neither study </w:t>
+      </w:r>
+      <w:r>
+        <w:t>looks at</w:t>
+      </w:r>
+      <w:r>
+        <w:t xml:space="preserve"> DAA, so the</w:t>
+      </w:r>
+      <w:r>
+        <w:t>y</w:t>
+      </w:r>
+      <w:r>
+        <w:t xml:space="preserve"> motivate the design </w:t>
+      </w:r>
+      <w:r>
+        <w:t>but cannot show</w:t>
+      </w:r>
+      <w:r>
+        <w:t xml:space="preserve"> local demand or educational benefit.</w:t>
       </w:r>
     </w:p>
     <w:p>
@@ -175,7 +536,40 @@
         <w:spacing w:line="276" w:lineRule="auto"/>
       </w:pPr>
       <w:r>
-        <w:t>Research supports investigating student communication and access barriers, but does not establish that a new platform automatically improves learning. The design therefore treats organised retrieval and sustained local participation as hypotheses to evaluate.</w:t>
+        <w:t xml:space="preserve">Safi (2026) reports connectivity problems, inadequate technical support, limited interaction and resource variety among surveyed Algerian Moodle users. </w:t>
+      </w:r>
+      <w:r>
+        <w:t>For Daa’is</w:t>
+      </w:r>
+      <w:r>
+        <w:t xml:space="preserve">t, </w:t>
+      </w:r>
+      <w:r>
+        <w:t>th</w:t>
+      </w:r>
+      <w:r>
+        <w:t>e main lesson is to keep</w:t>
+      </w:r>
+      <w:r>
+        <w:t xml:space="preserve"> pages</w:t>
+      </w:r>
+      <w:r>
+        <w:t xml:space="preserve"> light enough for weak connections</w:t>
+      </w:r>
+      <w:r>
+        <w:t xml:space="preserve">. Moodle already supports course files and folders (Moodle, n.d.). Daa’ist </w:t>
+      </w:r>
+      <w:r>
+        <w:t>is meant to complement it by keeping resources available</w:t>
+      </w:r>
+      <w:r>
+        <w:t xml:space="preserve"> across cohorts and </w:t>
+      </w:r>
+      <w:r>
+        <w:t>linking them to club activity</w:t>
+      </w:r>
+      <w:r>
+        <w:t>.</w:t>
       </w:r>
     </w:p>
     <w:p>
@@ -183,7 +577,21 @@
         <w:spacing w:line="276" w:lineRule="auto"/>
       </w:pPr>
       <w:r>
-        <w:t>Baishya and Maheshwari (2020) analysed one year of conversation in four educational WhatsApp groups and interviewed eight participants. Their findings describe academic uses alongside distraction and time burdens. Le Roux and Parry (2022, published online in 2021) surveyed 1,752 undergraduates about academic messaging groups. They found associations with academic and social outcomes, but questioned the practical significance of the small effects. Neither study directly evaluates Daa’ist or DAA, so their findings motivate the design without proving local demand or educational benefit.</w:t>
+        <w:t xml:space="preserve">UNESCO (2019) defines open educational resources through public-domain status or an open licence permitting reuse and redistribution. Daa’ist </w:t>
+      </w:r>
+      <w:r>
+        <w:t>also aims to widen access to resources</w:t>
+      </w:r>
+      <w:r>
+        <w:t xml:space="preserve">, but its content cannot be called OER until contributors agree to an open </w:t>
+      </w:r>
+      <w:proofErr w:type="spellStart"/>
+      <w:r>
+        <w:t>licence</w:t>
+      </w:r>
+      <w:proofErr w:type="spellEnd"/>
+      <w:r>
+        <w:t>.</w:t>
       </w:r>
     </w:p>
     <w:p>
@@ -191,7 +599,7 @@
         <w:spacing w:line="276" w:lineRule="auto"/>
       </w:pPr>
       <w:r>
-        <w:t>Safi (2026) reports connectivity problems, inadequate technical support, limited interaction and resource variety among surveyed Algerian Moodle users. This suggests attention to page weight, support and usable content. It does not show that all Algerian students reject institutional systems. Moodle already supports course files and folders (Moodle, n.d.). Daa’ist consequently complements institutional teaching through continuity across cohorts and integration with clubs, rather than claiming that learning-management systems cannot organise resources.</w:t>
+        <w:t>The OWASP Top 10 for 2021 ranks Broken Access Control first (OWASP, 2021). This supports explicit permission checks for profiles, uploads and participant records.</w:t>
       </w:r>
     </w:p>
     <w:p>
@@ -199,23 +607,21 @@
         <w:spacing w:line="276" w:lineRule="auto"/>
       </w:pPr>
       <w:r>
-        <w:t>UNESCO (2019) defines open educational resources through public-domain status or an open licence permitting reuse and redistribution. Daa’ist shares the aim of improving resource access, but authentication and community sharing alone do not establish OER status. Contributor permissions and licensing must be established before content is described as openly licensed.</w:t>
-      </w:r>
-    </w:p>
-    <w:p>
-      <w:pPr>
-        <w:spacing w:line="276" w:lineRule="auto"/>
-      </w:pPr>
-      <w:r>
-        <w:t>The OWASP Top 10 for 2021 ranks Broken Access Control first (OWASP, 2021). This supports explicit permission checks for profiles, uploads and participant records. The ranking identifies a relevant risk category; it is not a finding that Daa’ist is secure or that its particular threats have been eliminated.</w:t>
-      </w:r>
-    </w:p>
-    <w:p>
-      <w:pPr>
-        <w:spacing w:line="276" w:lineRule="auto"/>
-      </w:pPr>
-      <w:r>
-        <w:t>These sources inform an organised catalogue, limited publishing permissions, attention to connectivity and restrained cost. Direct student feedback remains necessary to test whether the chosen workflow is preferable to existing channels.</w:t>
+        <w:t xml:space="preserve">These sources </w:t>
+      </w:r>
+      <w:r>
+        <w:t xml:space="preserve">led to four design choices: an </w:t>
+      </w:r>
+      <w:proofErr w:type="spellStart"/>
+      <w:r>
+        <w:t>organised</w:t>
+      </w:r>
+      <w:proofErr w:type="spellEnd"/>
+      <w:r>
+        <w:t xml:space="preserve"> catalogue, limited publishing rights, light pages for slow connections and low running costs. Only student feedback can show whether this works better than</w:t>
+      </w:r>
+      <w:r>
+        <w:t xml:space="preserve"> existing channels.</w:t>
       </w:r>
     </w:p>
     <w:p>
@@ -240,7 +646,6 @@
         <w:pStyle w:val="TableCaption"/>
       </w:pPr>
       <w:r>
-        <w:lastRenderedPageBreak/>
         <w:t>Table 1. Account and club capabilities.</w:t>
       </w:r>
     </w:p>
@@ -835,7 +1240,13 @@
         <w:spacing w:line="276" w:lineRule="auto"/>
       </w:pPr>
       <w:r>
-        <w:t>Sign in through Supabase Auth and complete onboarding with study-year and enrolment information.</w:t>
+        <w:t>Sign in through Supabase Auth and complete onboarding with study</w:t>
+      </w:r>
+      <w:r>
+        <w:t xml:space="preserve"> </w:t>
+      </w:r>
+      <w:r>
+        <w:t>year and enrolment information.</w:t>
       </w:r>
     </w:p>
     <w:p>
@@ -848,6 +1259,7 @@
         <w:spacing w:line="276" w:lineRule="auto"/>
       </w:pPr>
       <w:r>
+        <w:lastRenderedPageBreak/>
         <w:t>Browse the catalogue by level and subject, filter summaries, and access administrative documents.</w:t>
       </w:r>
     </w:p>
@@ -1042,7 +1454,6 @@
         <w:spacing w:line="276" w:lineRule="auto"/>
       </w:pPr>
       <w:r>
-        <w:lastRenderedPageBreak/>
         <w:t>4. System</w:t>
       </w:r>
       <w:r>
@@ -1054,7 +1465,25 @@
         <w:spacing w:line="276" w:lineRule="auto"/>
       </w:pPr>
       <w:r>
-        <w:t>The system combines one Next.js application with Supabase, Cloudflare R2 and an external plotting API. Protected application operations check sessions and permissions on the server. Direct storage and Realtime connections have separate access implications, illustrated in Figure 1.</w:t>
+        <w:t xml:space="preserve">The system combines one Next.js application with Supabase, Cloudflare R2 and an external plotting API. Protected application operations check sessions and permissions on the server. </w:t>
+      </w:r>
+      <w:r>
+        <w:t>Figure 1 shows that file downloads</w:t>
+      </w:r>
+      <w:r>
+        <w:t xml:space="preserve"> and Realtime connections </w:t>
+      </w:r>
+      <w:r>
+        <w:t>follow different</w:t>
+      </w:r>
+      <w:r>
+        <w:t xml:space="preserve"> access </w:t>
+      </w:r>
+      <w:r>
+        <w:t>paths</w:t>
+      </w:r>
+      <w:r>
+        <w:t>.</w:t>
       </w:r>
     </w:p>
     <w:p>
@@ -1081,7 +1510,7 @@
                     <pic:cNvPicPr/>
                   </pic:nvPicPr>
                   <pic:blipFill>
-                    <a:blip r:embed="rId7"/>
+                    <a:blip r:embed="rId9"/>
                     <a:stretch>
                       <a:fillRect/>
                     </a:stretch>
@@ -1117,6 +1546,7 @@
         <w:spacing w:line="276" w:lineRule="auto"/>
       </w:pPr>
       <w:r>
+        <w:lastRenderedPageBreak/>
         <w:t>Page and API requests reach Next.js over HTTPS. The server issues a short-lived signed PUT URL for authorised uploads. Downloads use public URLs on cdn.daaist.com; possession of a file URL does not require a fresh application session. Chat writes use a checked server action, while subscriptions connect directly to Supabase and require appropriate database and Realtime policies.</w:t>
       </w:r>
     </w:p>
@@ -1125,7 +1555,7 @@
         <w:spacing w:line="276" w:lineRule="auto"/>
       </w:pPr>
       <w:r>
-        <w:t>React Server Components allow protected pages to check the session before returning their data. This protection depends on the implemented checks; server rendering alone does not guarantee confidentiality. Client components handle interactive forms, the scanner, chat and administrative controls.</w:t>
+        <w:t>React Server Components allow protected pages to check the session before returning their data. Client components handle interactive forms, the scanner, chat and administrative controls.</w:t>
       </w:r>
     </w:p>
     <w:p>
@@ -1141,8 +1571,13 @@
         <w:pStyle w:val="BodyLead-in"/>
       </w:pPr>
       <w:r>
-        <w:lastRenderedPageBreak/>
-        <w:t>PostgreSQL fits the relationships between users, files, clubs and registrations. The source references the following twelve application tables:</w:t>
+        <w:t xml:space="preserve">PostgreSQL fits the relationships between users, files, clubs and registrations. The </w:t>
+      </w:r>
+      <w:r>
+        <w:t>codebas</w:t>
+      </w:r>
+      <w:r>
+        <w:t>e references the following twelve application tables:</w:t>
       </w:r>
     </w:p>
     <w:p>
@@ -1540,7 +1975,19 @@
         <w:spacing w:line="276" w:lineRule="auto"/>
       </w:pPr>
       <w:r>
-        <w:t>A configurable api.daaist.com endpoint performs diagram generation outside the Next.js application. Its underlying infrastructure and capacity require separate operational documentation.</w:t>
+        <w:t xml:space="preserve">A configurable api.daaist.com endpoint performs diagram generation outside the Next.js application. Its </w:t>
+      </w:r>
+      <w:r>
+        <w:t>hosting</w:t>
+      </w:r>
+      <w:r>
+        <w:t xml:space="preserve"> and capacity </w:t>
+      </w:r>
+      <w:r>
+        <w:t>are not documented here</w:t>
+      </w:r>
+      <w:r>
+        <w:t>.</w:t>
       </w:r>
     </w:p>
     <w:p>
@@ -1560,7 +2007,13 @@
         <w:spacing w:line="276" w:lineRule="auto"/>
       </w:pPr>
       <w:r>
-        <w:t>The choices favour managed services and a single application codebase. The alternatives below explain practical trade-offs rather than proving that competing technologies are unsuitable.</w:t>
+        <w:t>The choices favour managed services and a single application codebase. T</w:t>
+      </w:r>
+      <w:r>
+        <w:t>able 3 lists the main alternative considered for each layer</w:t>
+      </w:r>
+      <w:r>
+        <w:t>.</w:t>
       </w:r>
     </w:p>
     <w:p>
@@ -1568,7 +2021,6 @@
         <w:pStyle w:val="TableCaption"/>
       </w:pPr>
       <w:r>
-        <w:lastRenderedPageBreak/>
         <w:t>Table 3. Technology choices and alternatives.</w:t>
       </w:r>
     </w:p>
@@ -1732,7 +2184,7 @@
           </w:tcPr>
           <w:p>
             <w:pPr>
-              <w:pStyle w:val="TableTextKeep"/>
+              <w:pStyle w:val="TableText"/>
             </w:pPr>
             <w:r>
               <w:t>Application</w:t>
@@ -1752,7 +2204,7 @@
           </w:tcPr>
           <w:p>
             <w:pPr>
-              <w:pStyle w:val="TableTextKeep"/>
+              <w:pStyle w:val="TableText"/>
             </w:pPr>
             <w:r>
               <w:t>Next.js 16, React 19</w:t>
@@ -1772,10 +2224,10 @@
           </w:tcPr>
           <w:p>
             <w:pPr>
-              <w:pStyle w:val="TableTextKeep"/>
-            </w:pPr>
-            <w:r>
-              <w:t>One application for pages and server routes; framework behaviour must be checked.</w:t>
+              <w:pStyle w:val="TableText"/>
+            </w:pPr>
+            <w:r>
+              <w:t>One application for pages and server routes.</w:t>
             </w:r>
           </w:p>
         </w:tc>
@@ -1792,7 +2244,7 @@
           </w:tcPr>
           <w:p>
             <w:pPr>
-              <w:pStyle w:val="TableTextKeep"/>
+              <w:pStyle w:val="TableText"/>
             </w:pPr>
             <w:r>
               <w:t>React SPA and Express</w:t>
@@ -1817,9 +2269,10 @@
           </w:tcPr>
           <w:p>
             <w:pPr>
-              <w:pStyle w:val="TableTextKeep"/>
-            </w:pPr>
-            <w:r>
+              <w:pStyle w:val="TableText"/>
+            </w:pPr>
+            <w:r>
+              <w:lastRenderedPageBreak/>
               <w:t>Language</w:t>
             </w:r>
           </w:p>
@@ -1837,7 +2290,7 @@
           </w:tcPr>
           <w:p>
             <w:pPr>
-              <w:pStyle w:val="TableTextKeep"/>
+              <w:pStyle w:val="TableText"/>
             </w:pPr>
             <w:r>
               <w:t>TypeScript 6</w:t>
@@ -1857,10 +2310,22 @@
           </w:tcPr>
           <w:p>
             <w:pPr>
-              <w:pStyle w:val="TableTextKeep"/>
-            </w:pPr>
-            <w:r>
-              <w:t>Checks declared shapes; runtime payloads still need validation.</w:t>
+              <w:pStyle w:val="TableText"/>
+            </w:pPr>
+            <w:r>
+              <w:t>C</w:t>
+            </w:r>
+            <w:r>
+              <w:t>atches type errors at build time</w:t>
+            </w:r>
+            <w:r>
+              <w:t xml:space="preserve">; </w:t>
+            </w:r>
+            <w:r>
+              <w:t>incoming data is validated separately</w:t>
+            </w:r>
+            <w:r>
+              <w:t>.</w:t>
             </w:r>
           </w:p>
         </w:tc>
@@ -1877,7 +2342,7 @@
           </w:tcPr>
           <w:p>
             <w:pPr>
-              <w:pStyle w:val="TableTextKeep"/>
+              <w:pStyle w:val="TableText"/>
             </w:pPr>
             <w:r>
               <w:t>JavaScript</w:t>
@@ -1902,7 +2367,7 @@
           </w:tcPr>
           <w:p>
             <w:pPr>
-              <w:pStyle w:val="TableTextKeep"/>
+              <w:pStyle w:val="TableText"/>
             </w:pPr>
             <w:r>
               <w:t>Interface</w:t>
@@ -1922,7 +2387,7 @@
           </w:tcPr>
           <w:p>
             <w:pPr>
-              <w:pStyle w:val="TableTextKeep"/>
+              <w:pStyle w:val="TableText"/>
             </w:pPr>
             <w:r>
               <w:t>Tailwind 4 and Radix primitives</w:t>
@@ -1942,10 +2407,18 @@
           </w:tcPr>
           <w:p>
             <w:pPr>
-              <w:pStyle w:val="TableTextKeep"/>
-            </w:pPr>
-            <w:r>
-              <w:t>Reusable controls with custom styling; accessibility still needs testing.</w:t>
+              <w:pStyle w:val="TableText"/>
+            </w:pPr>
+            <w:proofErr w:type="spellStart"/>
+            <w:r>
+              <w:t>Unstyled</w:t>
+            </w:r>
+            <w:proofErr w:type="spellEnd"/>
+            <w:r>
+              <w:t>, reusable controls that fit a custom design</w:t>
+            </w:r>
+            <w:r>
+              <w:t>.</w:t>
             </w:r>
           </w:p>
         </w:tc>
@@ -1962,7 +2435,7 @@
           </w:tcPr>
           <w:p>
             <w:pPr>
-              <w:pStyle w:val="TableTextKeep"/>
+              <w:pStyle w:val="TableText"/>
             </w:pPr>
             <w:r>
               <w:t>Material UI</w:t>
@@ -1987,7 +2460,7 @@
           </w:tcPr>
           <w:p>
             <w:pPr>
-              <w:pStyle w:val="TableTextKeep"/>
+              <w:pStyle w:val="TableText"/>
             </w:pPr>
             <w:r>
               <w:t>Identity</w:t>
@@ -2007,7 +2480,7 @@
           </w:tcPr>
           <w:p>
             <w:pPr>
-              <w:pStyle w:val="TableTextKeep"/>
+              <w:pStyle w:val="TableText"/>
             </w:pPr>
             <w:r>
               <w:t>Supabase Auth with SSR</w:t>
@@ -2027,10 +2500,25 @@
           </w:tcPr>
           <w:p>
             <w:pPr>
-              <w:pStyle w:val="TableTextKeep"/>
-            </w:pPr>
-            <w:r>
-              <w:t>Managed OAuth and cookies; configuration remains security-critical.</w:t>
+              <w:pStyle w:val="TableText"/>
+            </w:pPr>
+            <w:r>
+              <w:t>Handles</w:t>
+            </w:r>
+            <w:r>
+              <w:t xml:space="preserve"> OAuth and </w:t>
+            </w:r>
+            <w:r>
+              <w:t xml:space="preserve">session </w:t>
+            </w:r>
+            <w:r>
+              <w:t>cookies</w:t>
+            </w:r>
+            <w:r>
+              <w:t xml:space="preserve"> out of the box</w:t>
+            </w:r>
+            <w:r>
+              <w:t>.</w:t>
             </w:r>
           </w:p>
         </w:tc>
@@ -2047,7 +2535,7 @@
           </w:tcPr>
           <w:p>
             <w:pPr>
-              <w:pStyle w:val="TableTextKeep"/>
+              <w:pStyle w:val="TableText"/>
             </w:pPr>
             <w:r>
               <w:t>Auth.js with an adapter</w:t>
@@ -2072,7 +2560,7 @@
           </w:tcPr>
           <w:p>
             <w:pPr>
-              <w:pStyle w:val="TableTextKeep"/>
+              <w:pStyle w:val="TableText"/>
             </w:pPr>
             <w:r>
               <w:t>Database</w:t>
@@ -2092,7 +2580,7 @@
           </w:tcPr>
           <w:p>
             <w:pPr>
-              <w:pStyle w:val="TableTextKeep"/>
+              <w:pStyle w:val="TableText"/>
             </w:pPr>
             <w:r>
               <w:t>Supabase PostgreSQL</w:t>
@@ -2112,7 +2600,7 @@
           </w:tcPr>
           <w:p>
             <w:pPr>
-              <w:pStyle w:val="TableTextKeep"/>
+              <w:pStyle w:val="TableText"/>
             </w:pPr>
             <w:r>
               <w:t>Relational joins and constraints fit memberships and attendance.</w:t>
@@ -2132,7 +2620,7 @@
           </w:tcPr>
           <w:p>
             <w:pPr>
-              <w:pStyle w:val="TableTextKeep"/>
+              <w:pStyle w:val="TableText"/>
             </w:pPr>
             <w:r>
               <w:t>Document database</w:t>
@@ -2157,7 +2645,7 @@
           </w:tcPr>
           <w:p>
             <w:pPr>
-              <w:pStyle w:val="TableTextKeep"/>
+              <w:pStyle w:val="TableText"/>
             </w:pPr>
             <w:r>
               <w:t>Updates</w:t>
@@ -2177,7 +2665,7 @@
           </w:tcPr>
           <w:p>
             <w:pPr>
-              <w:pStyle w:val="TableTextKeep"/>
+              <w:pStyle w:val="TableText"/>
             </w:pPr>
             <w:r>
               <w:t>Supabase Realtime</w:t>
@@ -2197,10 +2685,19 @@
           </w:tcPr>
           <w:p>
             <w:pPr>
-              <w:pStyle w:val="TableTextKeep"/>
-            </w:pPr>
-            <w:r>
-              <w:t>Managed chat subscriptions; read policies need verification.</w:t>
+              <w:pStyle w:val="TableText"/>
+            </w:pPr>
+            <w:r>
+              <w:t>Live</w:t>
+            </w:r>
+            <w:r>
+              <w:t xml:space="preserve"> chat </w:t>
+            </w:r>
+            <w:r>
+              <w:t>updates without running a WebSocket server</w:t>
+            </w:r>
+            <w:r>
+              <w:t>.</w:t>
             </w:r>
           </w:p>
         </w:tc>
@@ -2217,7 +2714,7 @@
           </w:tcPr>
           <w:p>
             <w:pPr>
-              <w:pStyle w:val="TableTextKeep"/>
+              <w:pStyle w:val="TableText"/>
             </w:pPr>
             <w:r>
               <w:t>Socket.IO or Pusher</w:t>
@@ -2242,7 +2739,7 @@
           </w:tcPr>
           <w:p>
             <w:pPr>
-              <w:pStyle w:val="TableTextKeep"/>
+              <w:pStyle w:val="TableText"/>
             </w:pPr>
             <w:r>
               <w:t>Resources</w:t>
@@ -2262,7 +2759,7 @@
           </w:tcPr>
           <w:p>
             <w:pPr>
-              <w:pStyle w:val="TableTextKeep"/>
+              <w:pStyle w:val="TableText"/>
             </w:pPr>
             <w:r>
               <w:t>Cloudflare R2</w:t>
@@ -2282,10 +2779,22 @@
           </w:tcPr>
           <w:p>
             <w:pPr>
-              <w:pStyle w:val="TableTextKeep"/>
-            </w:pPr>
-            <w:r>
-              <w:t>Direct uploads and free internet egress; requests and storage remain metered.</w:t>
+              <w:pStyle w:val="TableText"/>
+            </w:pPr>
+            <w:r>
+              <w:t>Direct uploads and free egress</w:t>
+            </w:r>
+            <w:r>
+              <w:t>, though</w:t>
+            </w:r>
+            <w:r>
+              <w:t xml:space="preserve"> storage </w:t>
+            </w:r>
+            <w:r>
+              <w:t>and requests are bill</w:t>
+            </w:r>
+            <w:r>
+              <w:t>ed.</w:t>
             </w:r>
           </w:p>
         </w:tc>
@@ -2302,7 +2811,7 @@
           </w:tcPr>
           <w:p>
             <w:pPr>
-              <w:pStyle w:val="TableTextKeep"/>
+              <w:pStyle w:val="TableText"/>
             </w:pPr>
             <w:r>
               <w:t>Amazon S3</w:t>
@@ -2327,7 +2836,7 @@
           </w:tcPr>
           <w:p>
             <w:pPr>
-              <w:pStyle w:val="TableTextKeep"/>
+              <w:pStyle w:val="TableText"/>
             </w:pPr>
             <w:r>
               <w:t>Images</w:t>
@@ -2347,7 +2856,7 @@
           </w:tcPr>
           <w:p>
             <w:pPr>
-              <w:pStyle w:val="TableTextKeep"/>
+              <w:pStyle w:val="TableText"/>
             </w:pPr>
             <w:r>
               <w:t>Supabase Storage</w:t>
@@ -2367,7 +2876,7 @@
           </w:tcPr>
           <w:p>
             <w:pPr>
-              <w:pStyle w:val="TableTextKeep"/>
+              <w:pStyle w:val="TableText"/>
             </w:pPr>
             <w:r>
               <w:t>Integration with the existing Supabase project.</w:t>
@@ -2387,7 +2896,7 @@
           </w:tcPr>
           <w:p>
             <w:pPr>
-              <w:pStyle w:val="TableTextKeep"/>
+              <w:pStyle w:val="TableText"/>
             </w:pPr>
             <w:r>
               <w:t>R2</w:t>
@@ -2412,7 +2921,7 @@
           </w:tcPr>
           <w:p>
             <w:pPr>
-              <w:pStyle w:val="TableTextKeep"/>
+              <w:pStyle w:val="TableText"/>
             </w:pPr>
             <w:r>
               <w:t>Hosting</w:t>
@@ -2432,7 +2941,7 @@
           </w:tcPr>
           <w:p>
             <w:pPr>
-              <w:pStyle w:val="TableTextKeep"/>
+              <w:pStyle w:val="TableText"/>
             </w:pPr>
             <w:r>
               <w:t>Vercel</w:t>
@@ -2452,10 +2961,25 @@
           </w:tcPr>
           <w:p>
             <w:pPr>
-              <w:pStyle w:val="TableTextKeep"/>
-            </w:pPr>
-            <w:r>
-              <w:t>Managed Next.js deployment; quotas and vendor dependence remain.</w:t>
+              <w:pStyle w:val="TableText"/>
+            </w:pPr>
+            <w:r>
+              <w:t>Deploys</w:t>
+            </w:r>
+            <w:r>
+              <w:t xml:space="preserve"> Next.js </w:t>
+            </w:r>
+            <w:r>
+              <w:t>with no server setup, at the cost of plan</w:t>
+            </w:r>
+            <w:r>
+              <w:t xml:space="preserve"> quotas and </w:t>
+            </w:r>
+            <w:r>
+              <w:t>lock-</w:t>
+            </w:r>
+            <w:r>
+              <w:t>in.</w:t>
             </w:r>
           </w:p>
         </w:tc>
@@ -2472,7 +2996,7 @@
           </w:tcPr>
           <w:p>
             <w:pPr>
-              <w:pStyle w:val="TableTextKeep"/>
+              <w:pStyle w:val="TableText"/>
             </w:pPr>
             <w:r>
               <w:t>Render or a VPS</w:t>
@@ -2497,7 +3021,7 @@
           </w:tcPr>
           <w:p>
             <w:pPr>
-              <w:pStyle w:val="TableTextKeep"/>
+              <w:pStyle w:val="TableText"/>
             </w:pPr>
             <w:r>
               <w:t>Diagrams</w:t>
@@ -2517,7 +3041,7 @@
           </w:tcPr>
           <w:p>
             <w:pPr>
-              <w:pStyle w:val="TableTextKeep"/>
+              <w:pStyle w:val="TableText"/>
             </w:pPr>
             <w:r>
               <w:t>External tools API</w:t>
@@ -2537,7 +3061,7 @@
           </w:tcPr>
           <w:p>
             <w:pPr>
-              <w:pStyle w:val="TableTextKeep"/>
+              <w:pStyle w:val="TableText"/>
             </w:pPr>
             <w:r>
               <w:t>Separates plotting from the web runtime; adds an upstream dependency.</w:t>
@@ -2557,7 +3081,7 @@
           </w:tcPr>
           <w:p>
             <w:pPr>
-              <w:pStyle w:val="TableTextKeep"/>
+              <w:pStyle w:val="TableText"/>
             </w:pPr>
             <w:r>
               <w:t>In-process generation</w:t>
@@ -2657,7 +3181,6 @@
         <w:spacing w:line="276" w:lineRule="auto"/>
       </w:pPr>
       <w:r>
-        <w:lastRenderedPageBreak/>
         <w:t>6. Implementation</w:t>
       </w:r>
     </w:p>
@@ -2845,7 +3368,7 @@
               <w:pStyle w:val="TableTextKeep"/>
             </w:pPr>
             <w:r>
-              <w:t>Administrative pages and invite redemption; per-operation checks remain necessary.</w:t>
+              <w:t>Administrative pages and invite redemption.</w:t>
             </w:r>
           </w:p>
         </w:tc>
@@ -3036,7 +3559,14 @@
         <w:spacing w:before="200" w:line="276" w:lineRule="auto"/>
       </w:pPr>
       <w:r>
-        <w:t>Capability helpers such as canUploadResources(), upload-key validation and participant-pass rules keep repeated decisions in shared modules. This makes selected business rules testable without running the framework. It does not make every module pure or remove the need to test the routes that call them.</w:t>
+        <w:lastRenderedPageBreak/>
+        <w:t xml:space="preserve">Capability helpers such as canUploadResources(), upload-key validation and participant-pass rules keep repeated decisions in shared modules. This makes selected business rules testable without running the framework. </w:t>
+      </w:r>
+      <w:r>
+        <w:t>The routes that call these helpers still need their own tests</w:t>
+      </w:r>
+      <w:r>
+        <w:t>.</w:t>
       </w:r>
     </w:p>
     <w:p>
@@ -3052,7 +3582,33 @@
         <w:spacing w:line="276" w:lineRule="auto"/>
       </w:pPr>
       <w:r>
-        <w:t>Public event registration applies input validation and duplicate handling. A random participant token becomes a QR pass. The check-in route requires a president, vice president or event manager of the relevant club before changing attendance. It records a timestamp and method, handles repeat scans without creating another check-in, and supports cancelling an incorrect entry. These code paths still need authenticated end-to-end tests against a dedicated test database.</w:t>
+        <w:t xml:space="preserve">Public event registration applies input validation and duplicate handling. A random participant token becomes a QR pass. The check-in route requires a president, vice president or event manager of the relevant club before changing attendance. </w:t>
+      </w:r>
+      <w:r>
+        <w:t>Each check-in store</w:t>
+      </w:r>
+      <w:r>
+        <w:t>s a timestamp and method</w:t>
+      </w:r>
+      <w:r>
+        <w:t>. Scanning the same pass twice does nothing</w:t>
+      </w:r>
+      <w:r>
+        <w:t xml:space="preserve">, </w:t>
+      </w:r>
+      <w:r>
+        <w:t xml:space="preserve">and an </w:t>
+      </w:r>
+      <w:proofErr w:type="spellStart"/>
+      <w:r>
+        <w:t>organiser</w:t>
+      </w:r>
+      <w:proofErr w:type="spellEnd"/>
+      <w:r>
+        <w:t xml:space="preserve"> can undo a mistaken</w:t>
+      </w:r>
+      <w:r>
+        <w:t xml:space="preserve"> check-in. These code paths still need authenticated end-to-end tests against a dedicated test database.</w:t>
       </w:r>
     </w:p>
     <w:p>
@@ -3060,7 +3616,22 @@
         <w:spacing w:line="276" w:lineRule="auto"/>
       </w:pPr>
       <w:r>
-        <w:t>Chat posting checks authentication and the DAA enrolment flag, caps messages at 1,000 characters and applies a request limit. History is limited to the latest 100 messages. Realtime subscriptions provide updates without an application-owned WebSocket server; their read policies require separate verification.</w:t>
+        <w:t>Posting a chat message requires sign-i</w:t>
+      </w:r>
+      <w:r>
+        <w:t>n and the DAA enrolment flag</w:t>
+      </w:r>
+      <w:r>
+        <w:t>. Messages are capped</w:t>
+      </w:r>
+      <w:r>
+        <w:t xml:space="preserve"> at 1,000 characters and </w:t>
+      </w:r>
+      <w:r>
+        <w:t>rate-limited</w:t>
+      </w:r>
+      <w:r>
+        <w:t>. History is limited to the latest 100 messages. Realtime subscriptions provide updates without an application-owned WebSocket server; their read policies require separate verification.</w:t>
       </w:r>
     </w:p>
     <w:p>
@@ -3068,7 +3639,19 @@
         <w:spacing w:line="276" w:lineRule="auto"/>
       </w:pPr>
       <w:r>
-        <w:t>The diagram routes validate numeric inputs, permitted years and appearance settings before calling the tools API. New tests cover palette and text-colour encoding, light or transparent backgrounds, output preservation and error handling with a mocked upstream. Image responses are buffered before returning; they are not fully streaming proxies.</w:t>
+        <w:t xml:space="preserve">The diagram routes validate numeric inputs, permitted years and appearance settings before calling the tools API. New tests cover palette and text-colour encoding, light or transparent backgrounds, output preservation and error handling with a mocked upstream. </w:t>
+      </w:r>
+      <w:r>
+        <w:t>The routes buffer each image in full</w:t>
+      </w:r>
+      <w:r>
+        <w:t xml:space="preserve"> before returning</w:t>
+      </w:r>
+      <w:r>
+        <w:t xml:space="preserve"> it</w:t>
+      </w:r>
+      <w:r>
+        <w:t>.</w:t>
       </w:r>
     </w:p>
     <w:p>
@@ -3076,7 +3659,13 @@
         <w:spacing w:line="276" w:lineRule="auto"/>
       </w:pPr>
       <w:r>
-        <w:t>Metadata, canonical URLs, a sitemap and JSON-LD describe public pages. Protected pages also use crawler directives. Robots rules and noindex guide indexing; they do not enforce authentication or guarantee removal from search results.</w:t>
+        <w:t xml:space="preserve">Metadata, canonical URLs, a sitemap and JSON-LD describe public pages. Protected pages also use crawler directives. </w:t>
+      </w:r>
+      <w:r>
+        <w:t>These directives only guide crawlers; access control relies on authentication</w:t>
+      </w:r>
+      <w:r>
+        <w:t>.</w:t>
       </w:r>
     </w:p>
     <w:p>
@@ -3085,7 +3674,6 @@
         <w:spacing w:line="276" w:lineRule="auto"/>
       </w:pPr>
       <w:r>
-        <w:lastRenderedPageBreak/>
         <w:t>7. Security</w:t>
       </w:r>
       <w:r>
@@ -3097,7 +3685,13 @@
         <w:spacing w:line="276" w:lineRule="auto"/>
       </w:pPr>
       <w:r>
-        <w:t>A remediation branch consolidates access checks, upload policy and regression tests. Table 5 summarises current controls and their limits; it does not represent an independent penetration-test certification.</w:t>
+        <w:t xml:space="preserve">A remediation branch </w:t>
+      </w:r>
+      <w:r>
+        <w:t>brings the access checks and upload policy together, with regression tests for both</w:t>
+      </w:r>
+      <w:r>
+        <w:t>. Table 5 summarises current controls and their limits.</w:t>
       </w:r>
     </w:p>
     <w:p>
@@ -3238,7 +3832,7 @@
           </w:tcPr>
           <w:p>
             <w:pPr>
-              <w:pStyle w:val="TableTextKeep"/>
+              <w:pStyle w:val="TableText"/>
             </w:pPr>
             <w:r>
               <w:t>Database clients</w:t>
@@ -3258,7 +3852,7 @@
           </w:tcPr>
           <w:p>
             <w:pPr>
-              <w:pStyle w:val="TableTextKeep"/>
+              <w:pStyle w:val="TableText"/>
             </w:pPr>
             <w:r>
               <w:t>Session client uses the anon key; privileged queries use a service-role client.</w:t>
@@ -3278,7 +3872,7 @@
           </w:tcPr>
           <w:p>
             <w:pPr>
-              <w:pStyle w:val="TableTextKeep"/>
+              <w:pStyle w:val="TableText"/>
             </w:pPr>
             <w:r>
               <w:t>Service-role operations bypass RLS and require explicit authorisation.</w:t>
@@ -3303,7 +3897,7 @@
           </w:tcPr>
           <w:p>
             <w:pPr>
-              <w:pStyle w:val="TableTextKeep"/>
+              <w:pStyle w:val="TableText"/>
             </w:pPr>
             <w:r>
               <w:t>Profile information</w:t>
@@ -3323,7 +3917,7 @@
           </w:tcPr>
           <w:p>
             <w:pPr>
-              <w:pStyle w:val="TableTextKeep"/>
+              <w:pStyle w:val="TableText"/>
             </w:pPr>
             <w:r>
               <w:t>Protected profile views and selected response fields.</w:t>
@@ -3343,7 +3937,7 @@
           </w:tcPr>
           <w:p>
             <w:pPr>
-              <w:pStyle w:val="TableTextKeep"/>
+              <w:pStyle w:val="TableText"/>
             </w:pPr>
             <w:r>
               <w:t>Check response fields and ownership on every relevant path.</w:t>
@@ -3368,7 +3962,7 @@
           </w:tcPr>
           <w:p>
             <w:pPr>
-              <w:pStyle w:val="TableTextKeep"/>
+              <w:pStyle w:val="TableText"/>
             </w:pPr>
             <w:r>
               <w:t>Capabilities</w:t>
@@ -3388,7 +3982,7 @@
           </w:tcPr>
           <w:p>
             <w:pPr>
-              <w:pStyle w:val="TableTextKeep"/>
+              <w:pStyle w:val="TableText"/>
             </w:pPr>
             <w:r>
               <w:t>Shared admin and resource-publishing rules.</w:t>
@@ -3408,7 +4002,7 @@
           </w:tcPr>
           <w:p>
             <w:pPr>
-              <w:pStyle w:val="TableTextKeep"/>
+              <w:pStyle w:val="TableText"/>
             </w:pPr>
             <w:r>
               <w:t>Global roles and per-club roles must remain separate.</w:t>
@@ -3433,9 +4027,10 @@
           </w:tcPr>
           <w:p>
             <w:pPr>
-              <w:pStyle w:val="TableTextKeep"/>
-            </w:pPr>
-            <w:r>
+              <w:pStyle w:val="TableText"/>
+            </w:pPr>
+            <w:r>
+              <w:lastRenderedPageBreak/>
               <w:t>Resource uploads</w:t>
             </w:r>
           </w:p>
@@ -3453,7 +4048,7 @@
           </w:tcPr>
           <w:p>
             <w:pPr>
-              <w:pStyle w:val="TableTextKeep"/>
+              <w:pStyle w:val="TableText"/>
             </w:pPr>
             <w:r>
               <w:t>Server-chosen namespace, declared size limits and stored content type.</w:t>
@@ -3473,7 +4068,7 @@
           </w:tcPr>
           <w:p>
             <w:pPr>
-              <w:pStyle w:val="TableTextKeep"/>
+              <w:pStyle w:val="TableText"/>
             </w:pPr>
             <w:r>
               <w:t>No content scanning; public CDN downloads remain shareable.</w:t>
@@ -3498,7 +4093,7 @@
           </w:tcPr>
           <w:p>
             <w:pPr>
-              <w:pStyle w:val="TableTextKeep"/>
+              <w:pStyle w:val="TableText"/>
             </w:pPr>
             <w:r>
               <w:t>Event passes</w:t>
@@ -3518,10 +4113,18 @@
           </w:tcPr>
           <w:p>
             <w:pPr>
-              <w:pStyle w:val="TableTextKeep"/>
-            </w:pPr>
-            <w:r>
-              <w:t>Identity-based pass access and organiser checks for attendance.</w:t>
+              <w:pStyle w:val="TableText"/>
+            </w:pPr>
+            <w:r>
+              <w:t xml:space="preserve">Identity-based pass access and organiser </w:t>
+            </w:r>
+            <w:proofErr w:type="gramStart"/>
+            <w:r>
+              <w:t>checks</w:t>
+            </w:r>
+            <w:proofErr w:type="gramEnd"/>
+            <w:r>
+              <w:t xml:space="preserve"> for attendance.</w:t>
             </w:r>
           </w:p>
         </w:tc>
@@ -3538,10 +4141,13 @@
           </w:tcPr>
           <w:p>
             <w:pPr>
-              <w:pStyle w:val="TableTextKeep"/>
-            </w:pPr>
-            <w:r>
-              <w:t>Tokens and participant information require runtime integration tests.</w:t>
+              <w:pStyle w:val="TableText"/>
+            </w:pPr>
+            <w:r>
+              <w:t>Not yet covered by</w:t>
+            </w:r>
+            <w:r>
+              <w:t xml:space="preserve"> integration tests.</w:t>
             </w:r>
           </w:p>
         </w:tc>
@@ -3563,7 +4169,7 @@
           </w:tcPr>
           <w:p>
             <w:pPr>
-              <w:pStyle w:val="TableTextKeep"/>
+              <w:pStyle w:val="TableText"/>
             </w:pPr>
             <w:r>
               <w:t>Redirects</w:t>
@@ -3583,7 +4189,7 @@
           </w:tcPr>
           <w:p>
             <w:pPr>
-              <w:pStyle w:val="TableTextKeep"/>
+              <w:pStyle w:val="TableText"/>
             </w:pPr>
             <w:r>
               <w:t>Only permitted local return paths.</w:t>
@@ -3603,10 +4209,13 @@
           </w:tcPr>
           <w:p>
             <w:pPr>
-              <w:pStyle w:val="TableTextKeep"/>
-            </w:pPr>
-            <w:r>
-              <w:t>New redirect paths need validation.</w:t>
+              <w:pStyle w:val="TableText"/>
+            </w:pPr>
+            <w:r>
+              <w:t>Any new redirect must be added to the permitted list</w:t>
+            </w:r>
+            <w:r>
+              <w:t>.</w:t>
             </w:r>
           </w:p>
         </w:tc>
@@ -3628,7 +4237,7 @@
           </w:tcPr>
           <w:p>
             <w:pPr>
-              <w:pStyle w:val="TableTextKeep"/>
+              <w:pStyle w:val="TableText"/>
             </w:pPr>
             <w:r>
               <w:t>Cookies</w:t>
@@ -3648,7 +4257,7 @@
           </w:tcPr>
           <w:p>
             <w:pPr>
-              <w:pStyle w:val="TableTextKeep"/>
+              <w:pStyle w:val="TableText"/>
             </w:pPr>
             <w:r>
               <w:t>Secure in production, SameSite=Lax and configured 30-day retention.</w:t>
@@ -3668,7 +4277,7 @@
           </w:tcPr>
           <w:p>
             <w:pPr>
-              <w:pStyle w:val="TableTextKeep"/>
+              <w:pStyle w:val="TableText"/>
             </w:pPr>
             <w:r>
               <w:t>Cookie retention is not a complete session-revocation policy.</w:t>
@@ -3693,7 +4302,7 @@
           </w:tcPr>
           <w:p>
             <w:pPr>
-              <w:pStyle w:val="TableTextKeep"/>
+              <w:pStyle w:val="TableText"/>
             </w:pPr>
             <w:r>
               <w:t>Headers</w:t>
@@ -3713,7 +4322,7 @@
           </w:tcPr>
           <w:p>
             <w:pPr>
-              <w:pStyle w:val="TableTextKeep"/>
+              <w:pStyle w:val="TableText"/>
             </w:pPr>
             <w:r>
               <w:t>CSP includes script-src 'self' 'unsafe-inline', configured R2 connect-src origins, frame restrictions, HSTS and nosniff.</w:t>
@@ -3733,7 +4342,7 @@
           </w:tcPr>
           <w:p>
             <w:pPr>
-              <w:pStyle w:val="TableTextKeep"/>
+              <w:pStyle w:val="TableText"/>
             </w:pPr>
             <w:r>
               <w:t>Inline scripts weaken XSS protection; nonce-based policy is future work.</w:t>
@@ -3758,7 +4367,7 @@
           </w:tcPr>
           <w:p>
             <w:pPr>
-              <w:pStyle w:val="TableTextKeep"/>
+              <w:pStyle w:val="TableText"/>
             </w:pPr>
             <w:r>
               <w:t>Abuse controls</w:t>
@@ -3778,10 +4387,10 @@
           </w:tcPr>
           <w:p>
             <w:pPr>
-              <w:pStyle w:val="TableTextKeep"/>
-            </w:pPr>
-            <w:r>
-              <w:t>18 named rate-limit rules, using account identity where available.</w:t>
+              <w:pStyle w:val="TableText"/>
+            </w:pPr>
+            <w:r>
+              <w:t>18 rate-limit rules, using account identity where available.</w:t>
             </w:r>
           </w:p>
         </w:tc>
@@ -3798,7 +4407,7 @@
           </w:tcPr>
           <w:p>
             <w:pPr>
-              <w:pStyle w:val="TableTextKeep"/>
+              <w:pStyle w:val="TableText"/>
             </w:pPr>
             <w:r>
               <w:t>Counters are local to each process.</w:t>
@@ -3877,7 +4486,25 @@
         <w:spacing w:before="200" w:line="276" w:lineRule="auto"/>
       </w:pPr>
       <w:r>
-        <w:t>The limiter prefers account identity because a campus network may place many students behind one public IP address. Unknown file types are stored as application/octet-stream attachments to reduce inline browser execution. This does not inspect file contents or prevent malware in a downloaded document. The service-role client bypasses row-level security, so elevated queries remain dependent on correct server-side authorisation (Supabase, n.d.).</w:t>
+        <w:t xml:space="preserve">The limiter prefers account identity because a campus network may place many students behind one public IP address. Unknown file types are stored as application/octet-stream attachments to reduce inline browser execution. </w:t>
+      </w:r>
+      <w:r>
+        <w:t>Files are</w:t>
+      </w:r>
+      <w:r>
+        <w:t xml:space="preserve"> not </w:t>
+      </w:r>
+      <w:r>
+        <w:t>scanned for</w:t>
+      </w:r>
+      <w:r>
+        <w:t xml:space="preserve"> malware. The service-role client bypasses row-level security, so e</w:t>
+      </w:r>
+      <w:r>
+        <w:t>very elevated query relies on the server checking permissions first</w:t>
+      </w:r>
+      <w:r>
+        <w:t xml:space="preserve"> (Supabase, n.d.).</w:t>
       </w:r>
     </w:p>
     <w:p>
@@ -3886,7 +4513,6 @@
         <w:spacing w:line="276" w:lineRule="auto"/>
       </w:pPr>
       <w:r>
-        <w:lastRenderedPageBreak/>
         <w:t>8. Testing</w:t>
       </w:r>
       <w:r>
@@ -3898,7 +4524,30 @@
         <w:pStyle w:val="BodyLead-in"/>
       </w:pPr>
       <w:r>
-        <w:t>On 27 October 2026, npm test passes all 132 tests across nine files on Node.js 24.18.0. Seventeen tests have been added since the earlier evaluation:</w:t>
+        <w:t>In October 2026, after some fixes</w:t>
+      </w:r>
+      <w:r>
+        <w:t xml:space="preserve">, </w:t>
+      </w:r>
+      <w:proofErr w:type="spellStart"/>
+      <w:r>
+        <w:t>npm</w:t>
+      </w:r>
+      <w:proofErr w:type="spellEnd"/>
+      <w:r>
+        <w:t xml:space="preserve"> test </w:t>
+      </w:r>
+      <w:r>
+        <w:t>passed</w:t>
+      </w:r>
+      <w:r>
+        <w:t xml:space="preserve"> all 132 tests across nine files on Node.js 24.18.0. </w:t>
+      </w:r>
+      <w:r>
+        <w:t>Table 6 breaks them down by file</w:t>
+      </w:r>
+      <w:r>
+        <w:t>:</w:t>
       </w:r>
     </w:p>
     <w:p>
@@ -4419,7 +5068,7 @@
         <w:tc>
           <w:tcPr>
             <w:tcW w:w="2200" w:type="dxa"/>
-            <w:shd w:val="clear" w:color="F2F5FA" w:fill="F2F5FA"/>
+            <w:shd w:val="clear" w:color="FFFFFF" w:fill="FFFFFF"/>
             <w:tcMar>
               <w:top w:w="60" w:type="dxa"/>
               <w:left w:w="120" w:type="dxa"/>
@@ -4439,7 +5088,7 @@
         <w:tc>
           <w:tcPr>
             <w:tcW w:w="960" w:type="dxa"/>
-            <w:shd w:val="clear" w:color="F2F5FA" w:fill="F2F5FA"/>
+            <w:shd w:val="clear" w:color="FFFFFF" w:fill="FFFFFF"/>
             <w:tcMar>
               <w:top w:w="60" w:type="dxa"/>
               <w:left w:w="120" w:type="dxa"/>
@@ -4459,7 +5108,7 @@
         <w:tc>
           <w:tcPr>
             <w:tcW w:w="6200" w:type="dxa"/>
-            <w:shd w:val="clear" w:color="F2F5FA" w:fill="F2F5FA"/>
+            <w:shd w:val="clear" w:color="FFFFFF" w:fill="FFFFFF"/>
             <w:tcMar>
               <w:top w:w="60" w:type="dxa"/>
               <w:left w:w="120" w:type="dxa"/>
@@ -4497,6 +5146,7 @@
               <w:pStyle w:val="TableText"/>
             </w:pPr>
             <w:r>
+              <w:lastRenderedPageBreak/>
               <w:t>diagram-appearance</w:t>
             </w:r>
           </w:p>
@@ -4549,7 +5199,7 @@
         <w:tc>
           <w:tcPr>
             <w:tcW w:w="2200" w:type="dxa"/>
-            <w:shd w:val="clear" w:color="F2F5FA" w:fill="F2F5FA"/>
+            <w:shd w:val="clear" w:color="FFFFFF" w:fill="FFFFFF"/>
             <w:tcMar>
               <w:top w:w="60" w:type="dxa"/>
               <w:left w:w="120" w:type="dxa"/>
@@ -4569,7 +5219,7 @@
         <w:tc>
           <w:tcPr>
             <w:tcW w:w="960" w:type="dxa"/>
-            <w:shd w:val="clear" w:color="F2F5FA" w:fill="F2F5FA"/>
+            <w:shd w:val="clear" w:color="FFFFFF" w:fill="FFFFFF"/>
             <w:tcMar>
               <w:top w:w="60" w:type="dxa"/>
               <w:left w:w="120" w:type="dxa"/>
@@ -4589,7 +5239,7 @@
         <w:tc>
           <w:tcPr>
             <w:tcW w:w="6200" w:type="dxa"/>
-            <w:shd w:val="clear" w:color="F2F5FA" w:fill="F2F5FA"/>
+            <w:shd w:val="clear" w:color="FFFFFF" w:fill="FFFFFF"/>
             <w:tcMar>
               <w:top w:w="60" w:type="dxa"/>
               <w:left w:w="120" w:type="dxa"/>
@@ -4613,7 +5263,25 @@
         <w:spacing w:before="200" w:line="276" w:lineRule="auto"/>
       </w:pPr>
       <w:r>
-        <w:t>Structural security tests scan selected source patterns. New diagram-route tests invoke handlers with mocked upstream responses; CSP tests inspect generated directives. Framework stubs and source scanning do not reproduce the complete Next.js request pipeline or deployed service policies.</w:t>
+        <w:t xml:space="preserve">Structural security tests scan selected source patterns. New diagram-route tests invoke handlers with mocked upstream responses; CSP tests inspect generated directives. </w:t>
+      </w:r>
+      <w:r>
+        <w:t>These tests stop short of</w:t>
+      </w:r>
+      <w:r>
+        <w:t xml:space="preserve"> the </w:t>
+      </w:r>
+      <w:r>
+        <w:t>full</w:t>
+      </w:r>
+      <w:r>
+        <w:t xml:space="preserve"> Next.js request pipeline </w:t>
+      </w:r>
+      <w:r>
+        <w:t>and the</w:t>
+      </w:r>
+      <w:r>
+        <w:t xml:space="preserve"> deployed service policies.</w:t>
       </w:r>
     </w:p>
     <w:p>
@@ -4621,7 +5289,27 @@
         <w:spacing w:line="276" w:lineRule="auto"/>
       </w:pPr>
       <w:r>
-        <w:t>The local .github/workflows/ci.yml defines installation, lint, type checking, tests and a dummy-configured build on Node.js 24 (GitHub, n.d.). However, .gitignore excludes .github and Git does not track this workflow. On 27 October, the repository Actions API returned zero runs and the master branch had no .github directory. CI therefore remains a local definition awaiting publication, not an operational release gate.</w:t>
+        <w:t xml:space="preserve">The local .github/workflows/ci.yml defines installation, lint, type checking, tests and a dummy-configured build on Node.js 24 (GitHub, n.d.). However, .gitignore excludes .github and Git does not track this workflow. </w:t>
+      </w:r>
+      <w:r>
+        <w:t>At the same time</w:t>
+      </w:r>
+      <w:r>
+        <w:t xml:space="preserve">, the repository Actions API returned zero runs and the master branch had </w:t>
+      </w:r>
+      <w:proofErr w:type="gramStart"/>
+      <w:r>
+        <w:t>no .github</w:t>
+      </w:r>
+      <w:proofErr w:type="gramEnd"/>
+      <w:r>
+        <w:t xml:space="preserve"> directory. CI </w:t>
+      </w:r>
+      <w:r>
+        <w:t>is therefore defined locally but not yet running on GitHub</w:t>
+      </w:r>
+      <w:r>
+        <w:t>.</w:t>
       </w:r>
     </w:p>
     <w:p>
@@ -4641,7 +5329,26 @@
         <w:spacing w:line="276" w:lineRule="auto"/>
       </w:pPr>
       <w:r>
-        <w:t>The public application is accessible at https://daaist.com. The project owner confirms Vercel hosting and master as the production branch, alongside Cloudflare services. GitHub independently shows master as the default branch. Public browser checks confirm selected responses; the Vercel deployment dashboard was not inspected.</w:t>
+        <w:t xml:space="preserve">The public application is accessible at https://daaist.com. </w:t>
+      </w:r>
+      <w:r>
+        <w:t xml:space="preserve">The site runs on </w:t>
+      </w:r>
+      <w:proofErr w:type="spellStart"/>
+      <w:r>
+        <w:t>Vercel</w:t>
+      </w:r>
+      <w:proofErr w:type="spellEnd"/>
+      <w:r>
+        <w:t xml:space="preserve">, with master as the production branch, and uses Cloudflare for file storage and delivery. Master is also the default branch on GitHub. The </w:t>
+      </w:r>
+      <w:proofErr w:type="spellStart"/>
+      <w:r>
+        <w:t>Vercel</w:t>
+      </w:r>
+      <w:proofErr w:type="spellEnd"/>
+      <w:r>
+        <w:t xml:space="preserve"> deployment dashboard was not checked for this report.</w:t>
       </w:r>
     </w:p>
     <w:p>
@@ -4649,7 +5356,6 @@
         <w:pStyle w:val="TableCaption"/>
       </w:pPr>
       <w:r>
-        <w:lastRenderedPageBreak/>
         <w:t>Table 7. Deployment components.</w:t>
       </w:r>
     </w:p>
@@ -5032,7 +5738,24 @@
         <w:spacing w:before="200" w:line="276" w:lineRule="auto"/>
       </w:pPr>
       <w:r>
-        <w:t>The evaluated application revision is 1984ad0, matching the GitHub master head observed on 27 October 2026. This match does not identify Vercel’s deployed commit. A release record should link the revision, completed checks, deployment URL and dashboard status.</w:t>
+        <w:t xml:space="preserve">The evaluated application revision is 1984ad0, matching the GitHub master head observed </w:t>
+      </w:r>
+      <w:r>
+        <w:t>in</w:t>
+      </w:r>
+      <w:r>
+        <w:t xml:space="preserve"> October 2026. </w:t>
+      </w:r>
+      <w:proofErr w:type="spellStart"/>
+      <w:r>
+        <w:t>Vercel’s</w:t>
+      </w:r>
+      <w:proofErr w:type="spellEnd"/>
+      <w:r>
+        <w:t xml:space="preserve"> deployed commit was not checked</w:t>
+      </w:r>
+      <w:r>
+        <w:t>. A release record should link the revision, completed checks, deployment URL and dashboard status.</w:t>
       </w:r>
     </w:p>
     <w:p>
@@ -5040,7 +5763,13 @@
         <w:spacing w:line="276" w:lineRule="auto"/>
       </w:pPr>
       <w:r>
-        <w:t>The example environment file documents Supabase, base URLs, tools and R2 configuration. NEXT_PUBLIC_ values can enter browser bundles; service-role and storage credentials must remain server-side. Ignoring .env files reduces accidental commits but does not prove that credentials have never leaked. Obsolete credentials should be removed and rotated through their providers.</w:t>
+        <w:t>The example environment file documents Supabase, base URLs, tools and R2 configuration. NEXT_PUBLIC_ values can enter browser bundles; service-role and storage credentials must remain server-side. Ignoring .env files reduces accidental commits</w:t>
+      </w:r>
+      <w:r>
+        <w:t>; obsolete credentials should still be revoked</w:t>
+      </w:r>
+      <w:r>
+        <w:t xml:space="preserve"> and rotated through their providers.</w:t>
       </w:r>
     </w:p>
     <w:p>
@@ -5056,7 +5785,20 @@
         <w:spacing w:line="276" w:lineRule="auto"/>
       </w:pPr>
       <w:r>
-        <w:t>Persistent application records reside in PostgreSQL and object storage. Vercel can scale application instances within plan and platform limits, while the database, external API and connection budgets may become bottlenecks. R2 internet egress is free, but storage and request operations can still incur charges (Cloudflare, n.d.). The in-memory limiter is an explicit exception to otherwise externalised state.</w:t>
+        <w:lastRenderedPageBreak/>
+        <w:t xml:space="preserve">Persistent application records reside in PostgreSQL and object storage. Vercel can scale application instances within plan and platform limits, while the database, external API and connection budgets may become bottlenecks. R2 internet egress is free, but storage and request operations can still incur charges (Cloudflare, n.d.). </w:t>
+      </w:r>
+      <w:r>
+        <w:t>Unlike the persistent records in PostgreSQL and object storage, the rate limiter’s counters live in each instance’</w:t>
+      </w:r>
+      <w:r>
+        <w:t xml:space="preserve">s </w:t>
+      </w:r>
+      <w:r>
+        <w:t>memory</w:t>
+      </w:r>
+      <w:r>
+        <w:t>.</w:t>
       </w:r>
     </w:p>
     <w:p>
@@ -5076,7 +5818,19 @@
         <w:spacing w:line="276" w:lineRule="auto"/>
       </w:pPr>
       <w:r>
-        <w:t>Evaluation was repeated on 27 October 2026 against local revision 1984ad0 and the public site. Fresh headless Edge sessions checked the homepage, course and document sign-in gates at 1440 × 960, plus the homepage at 390 × 844. All four checks passed. No accounts or production records were changed; authenticated workflows were not exercised.</w:t>
+        <w:t xml:space="preserve">Evaluation was </w:t>
+      </w:r>
+      <w:r>
+        <w:t>carried out</w:t>
+      </w:r>
+      <w:r>
+        <w:t xml:space="preserve"> </w:t>
+      </w:r>
+      <w:r>
+        <w:t>in</w:t>
+      </w:r>
+      <w:r>
+        <w:t xml:space="preserve"> October 2026 against local revision 1984ad0 and the public site. Fresh headless Edge sessions checked the homepage, course and document sign-in gates at 1440 × 960, plus the homepage at 390 × 844. All four checks passed. No accounts or production records were changed; authenticated workflows were not exercised.</w:t>
       </w:r>
     </w:p>
     <w:p>
@@ -5084,7 +5838,13 @@
         <w:pStyle w:val="TableCaption"/>
       </w:pPr>
       <w:r>
-        <w:t>Table 8. Evaluation observations on 27 October 2026.</w:t>
+        <w:t xml:space="preserve">Table 8. Evaluation observations </w:t>
+      </w:r>
+      <w:r>
+        <w:t>in</w:t>
+      </w:r>
+      <w:r>
+        <w:t xml:space="preserve"> October 2026.</w:t>
       </w:r>
     </w:p>
     <w:tbl>
@@ -5792,7 +6552,7 @@
         <w:tc>
           <w:tcPr>
             <w:tcW w:w="1462" w:type="dxa"/>
-            <w:shd w:val="clear" w:color="FFFFFF" w:fill="FFFFFF"/>
+            <w:shd w:val="clear" w:color="F2F5FA" w:fill="F2F5FA"/>
             <w:tcMar>
               <w:top w:w="60" w:type="dxa"/>
               <w:left w:w="120" w:type="dxa"/>
@@ -5812,7 +6572,7 @@
         <w:tc>
           <w:tcPr>
             <w:tcW w:w="3010" w:type="dxa"/>
-            <w:shd w:val="clear" w:color="FFFFFF" w:fill="FFFFFF"/>
+            <w:shd w:val="clear" w:color="F2F5FA" w:fill="F2F5FA"/>
             <w:tcMar>
               <w:top w:w="60" w:type="dxa"/>
               <w:left w:w="120" w:type="dxa"/>
@@ -5832,7 +6592,7 @@
         <w:tc>
           <w:tcPr>
             <w:tcW w:w="4886" w:type="dxa"/>
-            <w:shd w:val="clear" w:color="FFFFFF" w:fill="FFFFFF"/>
+            <w:shd w:val="clear" w:color="F2F5FA" w:fill="F2F5FA"/>
             <w:tcMar>
               <w:top w:w="60" w:type="dxa"/>
               <w:left w:w="120" w:type="dxa"/>
@@ -5856,7 +6616,13 @@
         <w:spacing w:before="200" w:line="276" w:lineRule="auto"/>
       </w:pPr>
       <w:r>
-        <w:t>Figures 2 and 3 were recaptured during this evaluation. No user counts, longitudinal usage, participant-study results or Lighthouse scores are claimed. Passing the limited checks does not establish improved academic outcomes, comprehensive accessibility or capacity under load.</w:t>
+        <w:t xml:space="preserve">Figures 2 and 3 were captured during this evaluation. </w:t>
+      </w:r>
+      <w:r>
+        <w:t>The report includes no user counts, usage over time, user-study results or Lighthouse scores</w:t>
+      </w:r>
+      <w:r>
+        <w:t>.</w:t>
       </w:r>
     </w:p>
     <w:p>
@@ -5864,22 +6630,27 @@
         <w:pStyle w:val="Figure"/>
       </w:pPr>
       <w:r>
+        <w:rPr>
+          <w:noProof/>
+        </w:rPr>
+        <w:lastRenderedPageBreak/>
         <w:drawing>
-          <wp:inline xmlns:a="http://schemas.openxmlformats.org/drawingml/2006/main" xmlns:pic="http://schemas.openxmlformats.org/drawingml/2006/picture">
+          <wp:inline distT="0" distB="0" distL="0" distR="0" wp14:anchorId="4D4CC964" wp14:editId="15D6F133">
             <wp:extent cx="5943600" cy="3962400"/>
+            <wp:effectExtent l="0" t="0" r="0" b="0"/>
             <wp:docPr id="4" name="Picture 4"/>
             <wp:cNvGraphicFramePr>
-              <a:graphicFrameLocks noChangeAspect="1"/>
+              <a:graphicFrameLocks xmlns:a="http://schemas.openxmlformats.org/drawingml/2006/main" noChangeAspect="1"/>
             </wp:cNvGraphicFramePr>
-            <a:graphic>
+            <a:graphic xmlns:a="http://schemas.openxmlformats.org/drawingml/2006/main">
               <a:graphicData uri="http://schemas.openxmlformats.org/drawingml/2006/picture">
-                <pic:pic>
+                <pic:pic xmlns:pic="http://schemas.openxmlformats.org/drawingml/2006/picture">
                   <pic:nvPicPr>
                     <pic:cNvPr id="0" name="image.png"/>
                     <pic:cNvPicPr/>
                   </pic:nvPicPr>
                   <pic:blipFill>
-                    <a:blip r:embed="rId8"/>
+                    <a:blip r:embed="rId10"/>
                     <a:stretch>
                       <a:fillRect/>
                     </a:stretch>
@@ -5889,7 +6660,9 @@
                       <a:off x="0" y="0"/>
                       <a:ext cx="5943600" cy="3962400"/>
                     </a:xfrm>
-                    <a:prstGeom prst="rect"/>
+                    <a:prstGeom prst="rect">
+                      <a:avLst/>
+                    </a:prstGeom>
                   </pic:spPr>
                 </pic:pic>
               </a:graphicData>
@@ -5905,7 +6678,13 @@
         <w:jc w:val="center"/>
       </w:pPr>
       <w:r>
-        <w:t>Figure 2. Public homepage captured on 27 October 2026 in a fresh, signed-out browser at 1440 × 960.</w:t>
+        <w:t xml:space="preserve">Figure 2. Public homepage captured </w:t>
+      </w:r>
+      <w:r>
+        <w:t>in</w:t>
+      </w:r>
+      <w:r>
+        <w:t xml:space="preserve"> October 2026 in a fresh, signed-out browser at 1440 × 960.</w:t>
       </w:r>
     </w:p>
     <w:p>
@@ -5913,22 +6692,27 @@
         <w:pStyle w:val="Figure"/>
       </w:pPr>
       <w:r>
+        <w:rPr>
+          <w:noProof/>
+        </w:rPr>
+        <w:lastRenderedPageBreak/>
         <w:drawing>
-          <wp:inline xmlns:a="http://schemas.openxmlformats.org/drawingml/2006/main" xmlns:pic="http://schemas.openxmlformats.org/drawingml/2006/picture">
+          <wp:inline distT="0" distB="0" distL="0" distR="0" wp14:anchorId="71EFEC45" wp14:editId="1C47FC7E">
             <wp:extent cx="5943600" cy="3962400"/>
+            <wp:effectExtent l="0" t="0" r="0" b="0"/>
             <wp:docPr id="5" name="Picture 5"/>
             <wp:cNvGraphicFramePr>
-              <a:graphicFrameLocks noChangeAspect="1"/>
+              <a:graphicFrameLocks xmlns:a="http://schemas.openxmlformats.org/drawingml/2006/main" noChangeAspect="1"/>
             </wp:cNvGraphicFramePr>
-            <a:graphic>
+            <a:graphic xmlns:a="http://schemas.openxmlformats.org/drawingml/2006/main">
               <a:graphicData uri="http://schemas.openxmlformats.org/drawingml/2006/picture">
-                <pic:pic>
+                <pic:pic xmlns:pic="http://schemas.openxmlformats.org/drawingml/2006/picture">
                   <pic:nvPicPr>
                     <pic:cNvPr id="0" name="image.png"/>
                     <pic:cNvPicPr/>
                   </pic:nvPicPr>
                   <pic:blipFill>
-                    <a:blip r:embed="rId9"/>
+                    <a:blip r:embed="rId11"/>
                     <a:stretch>
                       <a:fillRect/>
                     </a:stretch>
@@ -5938,7 +6722,9 @@
                       <a:off x="0" y="0"/>
                       <a:ext cx="5943600" cy="3962400"/>
                     </a:xfrm>
-                    <a:prstGeom prst="rect"/>
+                    <a:prstGeom prst="rect">
+                      <a:avLst/>
+                    </a:prstGeom>
                   </pic:spPr>
                 </pic:pic>
               </a:graphicData>
@@ -5954,7 +6740,13 @@
         <w:jc w:val="center"/>
       </w:pPr>
       <w:r>
-        <w:t>Figure 3. Anonymous access to /courses displays the sign-in gate on 27 October 2026; /docs also passed its separate access-gate check.</w:t>
+        <w:t xml:space="preserve">Figure 3. Anonymous access to /courses displays the sign-in gate </w:t>
+      </w:r>
+      <w:r>
+        <w:t>in</w:t>
+      </w:r>
+      <w:r>
+        <w:t xml:space="preserve"> October 2026; /docs also passed its separate access-gate check.</w:t>
       </w:r>
     </w:p>
     <w:p>
@@ -5975,7 +6767,19 @@
         <w:pStyle w:val="BodyLead-in"/>
       </w:pPr>
       <w:r>
-        <w:t>The remaining limitations affect confidentiality, reproducibility and confidence in operation:</w:t>
+        <w:t>T</w:t>
+      </w:r>
+      <w:r>
+        <w:t>able 9 lists the main</w:t>
+      </w:r>
+      <w:r>
+        <w:t xml:space="preserve"> limitations and </w:t>
+      </w:r>
+      <w:r>
+        <w:t>the next step for each</w:t>
+      </w:r>
+      <w:r>
+        <w:t>:</w:t>
       </w:r>
     </w:p>
     <w:p>
@@ -6399,7 +7203,13 @@
               <w:pStyle w:val="TableTextKeep"/>
             </w:pPr>
             <w:r>
-              <w:t>A fresh database cannot be reproduced from source alone.</w:t>
+              <w:t xml:space="preserve">A fresh database cannot be reproduced from </w:t>
+            </w:r>
+            <w:r>
+              <w:t>the repository</w:t>
+            </w:r>
+            <w:r>
+              <w:t xml:space="preserve"> alone.</w:t>
             </w:r>
           </w:p>
         </w:tc>
@@ -6529,7 +7339,13 @@
               <w:pStyle w:val="TableTextKeep"/>
             </w:pPr>
             <w:r>
-              <w:t>Benefits, capacity and service costs remain uncertain.</w:t>
+              <w:t>Benefits</w:t>
+            </w:r>
+            <w:r>
+              <w:t xml:space="preserve"> and capacity are unknown, and so are running costs at scale</w:t>
+            </w:r>
+            <w:r>
+              <w:t>.</w:t>
             </w:r>
           </w:p>
         </w:tc>
@@ -6642,7 +7458,22 @@
         <w:spacing w:line="276" w:lineRule="auto"/>
       </w:pPr>
       <w:r>
-        <w:t>Daa’ist integrates official student documents, learning resources and club operations through managed cloud services. The refreshed evaluation records 132 passing tests, successful type and build checks, and four passing public browser checks. Remaining limits include 85 lint errors, an unpublished CI workflow, public file URLs and incomplete runtime evidence. Further operational and user evaluation is required before claiming comprehensive production readiness.</w:t>
+        <w:t xml:space="preserve">Daa’ist </w:t>
+      </w:r>
+      <w:r>
+        <w:t xml:space="preserve">brings official student documents, course resources and club activity into one platform built on managed cloud services. </w:t>
+      </w:r>
+      <w:r>
+        <w:t>All 132 tests passed in the October 2026 evaluation. The type check, build and four public browser checks also succeeded</w:t>
+      </w:r>
+      <w:r>
+        <w:t xml:space="preserve">. Remaining limits include 85 lint errors, an unpublished CI workflow, public file URLs and incomplete runtime evidence. </w:t>
+      </w:r>
+      <w:r>
+        <w:t>The platform needs user testing and load testing before it can be called production-ready</w:t>
+      </w:r>
+      <w:r>
+        <w:t>.</w:t>
       </w:r>
     </w:p>
     <w:p>
@@ -6670,10 +7501,13 @@
         </w:rPr>
         <w:t xml:space="preserve">Baishya, D. and Maheshwari, S. (2020). WhatsApp Groups in Academic Context: Exploring the Academic Uses of WhatsApp Groups among the Students. Contemporary Educational Technology, 11(1), 31–46. </w:t>
       </w:r>
-      <w:hyperlink r:id="rId10">
+      <w:hyperlink r:id="rId12" w:history="1">
         <w:r>
           <w:rPr>
+            <w:rStyle w:val="Hyperlink"/>
+            <w:color w:val="000000"/>
             <w:sz w:val="21"/>
+            <w:u w:val="none"/>
           </w:rPr>
           <w:t>https://doi.org/10.30935/cet.641765</w:t>
         </w:r>
@@ -6698,14 +7532,17 @@
         <w:rPr>
           <w:sz w:val="21"/>
         </w:rPr>
-        <w:t xml:space="preserve">le Roux, D. B. and Parry, D. A. (2022). An exploratory investigation of the use and effects of academic instant messaging groups among university students. Education and Information Technologies, 27, 1055–1080. Published online 7 July 2021. </w:t>
-      </w:r>
-      <w:hyperlink r:id="rId11">
+        <w:t xml:space="preserve">Cloudflare (n.d.). R2 pricing. Documentation. </w:t>
+      </w:r>
+      <w:hyperlink r:id="rId13" w:history="1">
         <w:r>
           <w:rPr>
+            <w:rStyle w:val="Hyperlink"/>
+            <w:color w:val="000000"/>
             <w:sz w:val="21"/>
+            <w:u w:val="none"/>
           </w:rPr>
-          <w:t>https://doi.org/10.1007/s10639-021-10631-y</w:t>
+          <w:t>https://developers.cloudflare.com/r2/pricing/</w:t>
         </w:r>
       </w:hyperlink>
       <w:r>
@@ -6728,14 +7565,17 @@
         <w:rPr>
           <w:sz w:val="21"/>
         </w:rPr>
-        <w:t xml:space="preserve">Safi, L. (2026). E-learning via Moodle Platform in Algerian Universities: An Analytical Study of Use and Practical Challenges from Students’ Perspective. Al-Risala Journal for Media Studies, 9(4), 113–132. </w:t>
-      </w:r>
-      <w:hyperlink r:id="rId12">
+        <w:t xml:space="preserve">GitHub (n.d.). Building and testing Node.js. GitHub Actions documentation. </w:t>
+      </w:r>
+      <w:hyperlink r:id="rId14" w:history="1">
         <w:r>
           <w:rPr>
+            <w:rStyle w:val="Hyperlink"/>
+            <w:color w:val="000000"/>
             <w:sz w:val="21"/>
+            <w:u w:val="none"/>
           </w:rPr>
-          <w:t>https://asjp.cerist.dz/en/article/289325</w:t>
+          <w:t>https://docs.github.com/en/actions/tutorials/build-and-test-code/nodejs</w:t>
         </w:r>
       </w:hyperlink>
       <w:r>
@@ -6758,14 +7598,17 @@
         <w:rPr>
           <w:sz w:val="21"/>
         </w:rPr>
-        <w:t xml:space="preserve">UNESCO (2019). Recommendation on Open Educational Resources (OER). Adopted 25 November 2019. </w:t>
-      </w:r>
-      <w:hyperlink r:id="rId13">
+        <w:t xml:space="preserve">le Roux, D. B. and Parry, D. A. (2022). An exploratory investigation of the use and effects of academic instant messaging groups among university students. Education and Information Technologies, 27, 1055–1080. Published online 7 July 2021. </w:t>
+      </w:r>
+      <w:hyperlink r:id="rId15" w:history="1">
         <w:r>
           <w:rPr>
+            <w:rStyle w:val="Hyperlink"/>
+            <w:color w:val="000000"/>
             <w:sz w:val="21"/>
+            <w:u w:val="none"/>
           </w:rPr>
-          <w:t>https://www.unesco.org/en/legal-affairs/recommendation-open-educational-resources-oer</w:t>
+          <w:t>https://doi.org/10.1007/s10639-021-10631-y</w:t>
         </w:r>
       </w:hyperlink>
       <w:r>
@@ -6788,14 +7631,31 @@
         <w:rPr>
           <w:sz w:val="21"/>
         </w:rPr>
-        <w:t xml:space="preserve">OWASP (2021). A01:2021 Broken Access Control. OWASP Top 10. </w:t>
-      </w:r>
-      <w:hyperlink r:id="rId14">
+        <w:t xml:space="preserve">Moodle (n.d.). Resources. </w:t>
+      </w:r>
+      <w:proofErr w:type="spellStart"/>
+      <w:r>
+        <w:rPr>
+          <w:sz w:val="21"/>
+        </w:rPr>
+        <w:t>MoodleDocs</w:t>
+      </w:r>
+      <w:proofErr w:type="spellEnd"/>
+      <w:r>
+        <w:rPr>
+          <w:sz w:val="21"/>
+        </w:rPr>
+        <w:t xml:space="preserve">. </w:t>
+      </w:r>
+      <w:hyperlink r:id="rId16" w:history="1">
         <w:r>
           <w:rPr>
+            <w:rStyle w:val="Hyperlink"/>
+            <w:color w:val="000000"/>
             <w:sz w:val="21"/>
+            <w:u w:val="none"/>
           </w:rPr>
-          <w:t>https://owasp.org/Top10/2021/A01_2021-Broken_Access_Control/</w:t>
+          <w:t>https://docs.moodle.org/en/Resources</w:t>
         </w:r>
       </w:hyperlink>
       <w:r>
@@ -6818,14 +7678,17 @@
         <w:rPr>
           <w:sz w:val="21"/>
         </w:rPr>
-        <w:t xml:space="preserve">Supabase (n.d.). Row Level Security. Documentation. </w:t>
-      </w:r>
-      <w:hyperlink r:id="rId15">
+        <w:t xml:space="preserve">OWASP (2021). A01:2021 Broken Access Control. OWASP Top 10. </w:t>
+      </w:r>
+      <w:hyperlink r:id="rId17" w:history="1">
         <w:r>
           <w:rPr>
+            <w:rStyle w:val="Hyperlink"/>
+            <w:color w:val="000000"/>
             <w:sz w:val="21"/>
+            <w:u w:val="none"/>
           </w:rPr>
-          <w:t>https://supabase.com/docs/guides/database/postgres/row-level-security</w:t>
+          <w:t>https://owasp.org/Top10/2021/A01_2021-Broken_Access_Control/</w:t>
         </w:r>
       </w:hyperlink>
       <w:r>
@@ -6848,14 +7711,17 @@
         <w:rPr>
           <w:sz w:val="21"/>
         </w:rPr>
-        <w:t xml:space="preserve">Cloudflare (n.d.). R2 pricing. Documentation. </w:t>
-      </w:r>
-      <w:hyperlink r:id="rId16">
+        <w:t xml:space="preserve">Safi, L. (2026). E-learning via Moodle Platform in Algerian Universities: An Analytical Study of Use and Practical Challenges from Students’ Perspective. Al-Risala Journal for Media Studies, 9(4), 113–132. </w:t>
+      </w:r>
+      <w:hyperlink r:id="rId18" w:history="1">
         <w:r>
           <w:rPr>
+            <w:rStyle w:val="Hyperlink"/>
+            <w:color w:val="000000"/>
             <w:sz w:val="21"/>
+            <w:u w:val="none"/>
           </w:rPr>
-          <w:t>https://developers.cloudflare.com/r2/pricing/</w:t>
+          <w:t>https://asjp.cerist.dz/en/article/289325</w:t>
         </w:r>
       </w:hyperlink>
       <w:r>
@@ -6874,18 +7740,29 @@
           <w:sz w:val="21"/>
         </w:rPr>
       </w:pPr>
+      <w:proofErr w:type="spellStart"/>
       <w:r>
         <w:rPr>
           <w:sz w:val="21"/>
         </w:rPr>
-        <w:t xml:space="preserve">Moodle (n.d.). Resources. MoodleDocs. </w:t>
-      </w:r>
-      <w:hyperlink r:id="rId17">
+        <w:t>Supabase</w:t>
+      </w:r>
+      <w:proofErr w:type="spellEnd"/>
+      <w:r>
+        <w:rPr>
+          <w:sz w:val="21"/>
+        </w:rPr>
+        <w:t xml:space="preserve"> (n.d.). Row Level Security. Documentation. </w:t>
+      </w:r>
+      <w:hyperlink r:id="rId19" w:history="1">
         <w:r>
           <w:rPr>
+            <w:rStyle w:val="Hyperlink"/>
+            <w:color w:val="000000"/>
             <w:sz w:val="21"/>
+            <w:u w:val="none"/>
           </w:rPr>
-          <w:t>https://docs.moodle.org/en/Resources</w:t>
+          <w:t>https://supabase.com/docs/guides/database/postgres/row-level-security</w:t>
         </w:r>
       </w:hyperlink>
       <w:r>
@@ -6908,14 +7785,17 @@
         <w:rPr>
           <w:sz w:val="21"/>
         </w:rPr>
-        <w:t xml:space="preserve">GitHub (n.d.). Building and testing Node.js. GitHub Actions documentation. </w:t>
-      </w:r>
-      <w:hyperlink r:id="rId18">
+        <w:t xml:space="preserve">UNESCO (2019). Recommendation on Open Educational Resources (OER). Adopted 25 November 2019. </w:t>
+      </w:r>
+      <w:hyperlink r:id="rId20" w:history="1">
         <w:r>
           <w:rPr>
+            <w:rStyle w:val="Hyperlink"/>
+            <w:color w:val="000000"/>
             <w:sz w:val="21"/>
+            <w:u w:val="none"/>
           </w:rPr>
-          <w:t>https://docs.github.com/en/actions/tutorials/build-and-test-code/nodejs</w:t>
+          <w:t>https://www.unesco.org/en/legal-affairs/recommendation-open-educational-resources-oer</w:t>
         </w:r>
       </w:hyperlink>
       <w:r>
@@ -6926,15 +7806,17 @@
       </w:r>
     </w:p>
     <w:sectPr>
-      <w:headerReference w:type="even" r:id="rId19"/>
-      <w:headerReference w:type="default" r:id="rId20"/>
-      <w:footerReference w:type="even" r:id="rId21"/>
-      <w:footerReference w:type="default" r:id="rId22"/>
-      <w:headerReference w:type="first" r:id="rId23"/>
-      <w:footerReference w:type="first" r:id="rId24"/>
+      <w:headerReference w:type="even" r:id="rId21"/>
+      <w:headerReference w:type="default" r:id="rId22"/>
+      <w:footerReference w:type="even" r:id="rId23"/>
+      <w:footerReference w:type="default" r:id="rId24"/>
+      <w:headerReference w:type="first" r:id="rId25"/>
+      <w:footerReference w:type="first" r:id="rId26"/>
       <w:pgSz w:w="12240" w:h="15840"/>
       <w:pgMar w:top="1440" w:right="1440" w:bottom="1440" w:left="1440" w:header="720" w:footer="720" w:gutter="0"/>
       <w:cols w:space="720"/>
+      <w:titlePg/>
+      <w:docGrid w:linePitch="299"/>
     </w:sectPr>
   </w:body>
 </w:document>
@@ -7694,7 +8576,6 @@
     <w:name w:val="Normal"/>
     <w:qFormat/>
     <w:pPr>
-      <w:widowControl/>
       <w:spacing w:after="120" w:line="276" w:lineRule="atLeast"/>
     </w:pPr>
     <w:rPr>
@@ -7807,7 +8688,6 @@
   <w:style w:type="character" w:default="1" w:styleId="DefaultParagraphFont">
     <w:name w:val="Default Paragraph Font"/>
     <w:uiPriority w:val="1"/>
-    <w:semiHidden/>
     <w:unhideWhenUsed/>
   </w:style>
   <w:style w:type="table" w:default="1" w:styleId="TableNormal">
@@ -8079,6 +8959,18 @@
       <w:spacing w:before="120" w:after="40" w:line="240" w:lineRule="atLeast"/>
       <w:jc w:val="center"/>
     </w:pPr>
+  </w:style>
+  <w:style w:type="character" w:styleId="UnresolvedMention">
+    <w:name w:val="Unresolved Mention"/>
+    <w:basedOn w:val="DefaultParagraphFont"/>
+    <w:uiPriority w:val="99"/>
+    <w:semiHidden/>
+    <w:unhideWhenUsed/>
+    <w:rsid w:val="00620454"/>
+    <w:rPr>
+      <w:color w:val="605E5C"/>
+      <w:shd w:val="clear" w:color="auto" w:fill="E1DFDD"/>
+    </w:rPr>
   </w:style>
 </w:styles>
 </file>
@@ -8376,4 +9268,26 @@
     </a:ext>
   </a:extLst>
 </a:theme>
+</file>
+
+<file path=word/webextensions/taskpanes.xml><?xml version="1.0" encoding="utf-8"?>
+<wetp:taskpanes xmlns:wetp="http://schemas.microsoft.com/office/webextensions/taskpanes/2010/11">
+  <wetp:taskpane dockstate="right" visibility="0" width="525" row="0">
+    <wetp:webextensionref xmlns:r="http://schemas.openxmlformats.org/officeDocument/2006/relationships" r:id="rId1"/>
+  </wetp:taskpane>
+</wetp:taskpanes>
+</file>
+
+<file path=word/webextensions/webextension1.xml><?xml version="1.0" encoding="utf-8"?>
+<we:webextension xmlns:we="http://schemas.microsoft.com/office/webextensions/webextension/2010/11" id="{FBCE1677-505F-4FAA-B71C-D30127DB3B67}">
+  <we:reference id="wa200010453" version="1.0.0.1" store="en-US" storeType="OMEX"/>
+  <we:alternateReferences>
+    <we:reference id="wa200010453" version="1.0.0.1" store="wa200010453" storeType="OMEX"/>
+  </we:alternateReferences>
+  <we:properties>
+    <we:property name="claude.fileId" value="&quot;6002f6fb-f613-4981-a22f-a2b410f977d7&quot;"/>
+  </we:properties>
+  <we:bindings/>
+  <we:snapshot xmlns:r="http://schemas.openxmlformats.org/officeDocument/2006/relationships"/>
+</we:webextension>
 </file>
</xml_diff>